<commit_message>
Hoàn thiện tính năng và cập nhật README
</commit_message>
<xml_diff>
--- a/docs/PHAN-TICH-VA-KE-HOACH.docx
+++ b/docs/PHAN-TICH-VA-KE-HOACH.docx
@@ -47,7 +47,7 @@
           <w:sz w:val="20"/>
           <w:szCs w:val="20"/>
         </w:rPr>
-        <w:t xml:space="preserve">Ngày lập: 15/09/2026  ·  Phiên bản: 1.0  ·  Giai đoạn: Phase 1 — Analysis (trước khi viết code)</w:t>
+        <w:t xml:space="preserve">Ngày lập: 15/09/2026  ·  Cập nhật: 17/09/2026  ·  Phiên bản: 2.0  ·  Giai đoạn: Phase 1 — Analysis, đồng bộ với code đã triển khai</w:t>
       </w:r>
     </w:p>
     <w:p>
@@ -61,6 +61,19 @@
           <w:szCs w:val="22"/>
         </w:rPr>
         <w:t xml:space="preserve">Tài liệu này trình bày phương án giải quyết bài toán "Hệ thống Quản lý Khách hàng cơ bản" trước khi bắt tay viết code, theo 3 nội dung bắt buộc: (1) phân tích chức năng &amp; UI, (2) thiết kế cơ sở dữ liệu, (3) ước lượng thời gian thực hiện. Bản phân tích kỹ thuật đầy đủ hơn (kiến trúc, API design, bảo mật, risk analysis, ERD) nằm trong docs/System-Analysis-Phase1.md kèm theo repository.</w:t>
+      </w:r>
+    </w:p>
+    <w:p>
+      <w:pPr>
+        <w:spacing w:after="160"/>
+      </w:pPr>
+      <w:r>
+        <w:rPr>
+          <w:rFonts w:ascii="Calibri" w:cs="Calibri" w:eastAsia="Calibri" w:hAnsi="Calibri"/>
+          <w:sz w:val="22"/>
+          <w:szCs w:val="22"/>
+        </w:rPr>
+        <w:t xml:space="preserve">Phiên bản 2.0 (17/09/2026) đối chiếu lại toàn bộ tài liệu với mã nguồn đã triển khai trên GitHub (commit 732cb1f): bổ sung 5 chức năng phát sinh sau MVP (F12–F16), 3 màn hình mới, 2 bảng dữ liệu mới (RefreshTokens, AuditLogs), sửa kiểu dữ liệu/index theo migration thực tế và thêm hạng mục ước lượng bổ sung. Phần phân tích ban đầu được giữ nguyên để lưu vết; các điểm thay đổi được ghi chú ngay tại mục tương ứng.</w:t>
       </w:r>
     </w:p>
     <w:p>
@@ -91,7 +104,7 @@
           <w:sz w:val="22"/>
           <w:szCs w:val="22"/>
         </w:rPr>
-        <w:t xml:space="preserve">Hệ thống có tổng cộng 11 chức năng, chia theo mức độ ưu tiên MoSCoW (Must/Should/Could/Bonus):</w:t>
+        <w:t xml:space="preserve">Hệ thống có tổng cộng 16 chức năng (11 chức năng phân tích ban đầu và 5 chức năng F12–F16 bổ sung khi triển khai), chia theo mức độ ưu tiên MoSCoW (Must/Should/Could/Bonus):</w:t>
       </w:r>
     </w:p>
     <w:tbl>
@@ -341,7 +354,7 @@
                 <w:sz w:val="20"/>
                 <w:szCs w:val="20"/>
               </w:rPr>
-              <w:t xml:space="preserve">Đăng nhập bằng tài khoản admin cứng (seed sẵn trong DB), nhận JWT</w:t>
+              <w:t xml:space="preserve">Đăng nhập bằng tài khoản admin cứng (seed sẵn trong DB), nhận access token JWT (15 phút) và refresh token</w:t>
             </w:r>
           </w:p>
         </w:tc>
@@ -481,7 +494,7 @@
                 <w:sz w:val="20"/>
                 <w:szCs w:val="20"/>
               </w:rPr>
-              <w:t xml:space="preserve">Xóa token phía client (in-memory), quay lại màn Login</w:t>
+              <w:t xml:space="preserve">Thu hồi refresh token phía server, xóa token in-memory, quay lại màn Login</w:t>
             </w:r>
           </w:p>
         </w:tc>
@@ -899,7 +912,7 @@
                 <w:sz w:val="20"/>
                 <w:szCs w:val="20"/>
               </w:rPr>
-              <w:t xml:space="preserve">Lọc danh sách theo Trạng thái hoạt động (Active/Inactive)</w:t>
+              <w:t xml:space="preserve">Lọc danh sách theo Trạng thái hoạt động (Active/Inactive) qua Filter Drawer</w:t>
             </w:r>
           </w:p>
         </w:tc>
@@ -1791,6 +1804,706 @@
                 <w:szCs w:val="20"/>
               </w:rPr>
               <w:t xml:space="preserve">Should</w:t>
+            </w:r>
+          </w:p>
+        </w:tc>
+      </w:tr>
+      <w:tr>
+        <w:tc>
+          <w:tcPr>
+            <w:tcW w:type="dxa" w:w="800"/>
+            <w:shd w:fill="F2F6FB" w:val="clear"/>
+            <w:tcMar>
+              <w:top w:type="dxa" w:w="80"/>
+              <w:left w:type="dxa" w:w="100"/>
+              <w:bottom w:type="dxa" w:w="80"/>
+              <w:right w:type="dxa" w:w="100"/>
+            </w:tcMar>
+            <w:vAlign w:val="center"/>
+          </w:tcPr>
+          <w:p>
+            <w:pPr>
+              <w:jc w:val="left"/>
+            </w:pPr>
+            <w:r>
+              <w:rPr>
+                <w:rFonts w:ascii="Calibri" w:cs="Calibri" w:eastAsia="Calibri" w:hAnsi="Calibri"/>
+                <w:b w:val="false"/>
+                <w:bCs w:val="false"/>
+                <w:sz w:val="20"/>
+                <w:szCs w:val="20"/>
+              </w:rPr>
+              <w:t xml:space="preserve">F12</w:t>
+            </w:r>
+          </w:p>
+        </w:tc>
+        <w:tc>
+          <w:tcPr>
+            <w:tcW w:type="dxa" w:w="1900"/>
+            <w:shd w:fill="F2F6FB" w:val="clear"/>
+            <w:tcMar>
+              <w:top w:type="dxa" w:w="80"/>
+              <w:left w:type="dxa" w:w="100"/>
+              <w:bottom w:type="dxa" w:w="80"/>
+              <w:right w:type="dxa" w:w="100"/>
+            </w:tcMar>
+            <w:vAlign w:val="center"/>
+          </w:tcPr>
+          <w:p>
+            <w:pPr>
+              <w:jc w:val="left"/>
+            </w:pPr>
+            <w:r>
+              <w:rPr>
+                <w:rFonts w:ascii="Calibri" w:cs="Calibri" w:eastAsia="Calibri" w:hAnsi="Calibri"/>
+                <w:b w:val="false"/>
+                <w:bCs w:val="false"/>
+                <w:sz w:val="20"/>
+                <w:szCs w:val="20"/>
+              </w:rPr>
+              <w:t xml:space="preserve">Duy trì phiên (Refresh token)</w:t>
+            </w:r>
+          </w:p>
+        </w:tc>
+        <w:tc>
+          <w:tcPr>
+            <w:tcW w:type="dxa" w:w="4600"/>
+            <w:shd w:fill="F2F6FB" w:val="clear"/>
+            <w:tcMar>
+              <w:top w:type="dxa" w:w="80"/>
+              <w:left w:type="dxa" w:w="100"/>
+              <w:bottom w:type="dxa" w:w="80"/>
+              <w:right w:type="dxa" w:w="100"/>
+            </w:tcMar>
+            <w:vAlign w:val="center"/>
+          </w:tcPr>
+          <w:p>
+            <w:pPr>
+              <w:jc w:val="left"/>
+            </w:pPr>
+            <w:r>
+              <w:rPr>
+                <w:rFonts w:ascii="Calibri" w:cs="Calibri" w:eastAsia="Calibri" w:hAnsi="Calibri"/>
+                <w:b w:val="false"/>
+                <w:bCs w:val="false"/>
+                <w:sz w:val="20"/>
+                <w:szCs w:val="20"/>
+              </w:rPr>
+              <w:t xml:space="preserve">Tự đổi refresh token lấy access token mới ~2 phút trước khi hết hạn; refresh token xoay vòng, DB chỉ lưu SHA-256 hash</w:t>
+            </w:r>
+          </w:p>
+        </w:tc>
+        <w:tc>
+          <w:tcPr>
+            <w:tcW w:type="dxa" w:w="1240"/>
+            <w:shd w:fill="F2F6FB" w:val="clear"/>
+            <w:tcMar>
+              <w:top w:type="dxa" w:w="80"/>
+              <w:left w:type="dxa" w:w="100"/>
+              <w:bottom w:type="dxa" w:w="80"/>
+              <w:right w:type="dxa" w:w="100"/>
+            </w:tcMar>
+            <w:vAlign w:val="center"/>
+          </w:tcPr>
+          <w:p>
+            <w:pPr>
+              <w:jc w:val="left"/>
+            </w:pPr>
+            <w:r>
+              <w:rPr>
+                <w:rFonts w:ascii="Calibri" w:cs="Calibri" w:eastAsia="Calibri" w:hAnsi="Calibri"/>
+                <w:b w:val="false"/>
+                <w:bCs w:val="false"/>
+                <w:sz w:val="20"/>
+                <w:szCs w:val="20"/>
+              </w:rPr>
+              <w:t xml:space="preserve">System</w:t>
+            </w:r>
+          </w:p>
+        </w:tc>
+        <w:tc>
+          <w:tcPr>
+            <w:tcW w:type="dxa" w:w="1900"/>
+            <w:shd w:fill="F2F6FB" w:val="clear"/>
+            <w:tcMar>
+              <w:top w:type="dxa" w:w="80"/>
+              <w:left w:type="dxa" w:w="100"/>
+              <w:bottom w:type="dxa" w:w="80"/>
+              <w:right w:type="dxa" w:w="100"/>
+            </w:tcMar>
+            <w:vAlign w:val="center"/>
+          </w:tcPr>
+          <w:p>
+            <w:pPr>
+              <w:jc w:val="left"/>
+            </w:pPr>
+            <w:r>
+              <w:rPr>
+                <w:rFonts w:ascii="Calibri" w:cs="Calibri" w:eastAsia="Calibri" w:hAnsi="Calibri"/>
+                <w:b w:val="false"/>
+                <w:bCs w:val="false"/>
+                <w:sz w:val="20"/>
+                <w:szCs w:val="20"/>
+              </w:rPr>
+              <w:t xml:space="preserve">Bonus — bổ sung bảo mật</w:t>
+            </w:r>
+          </w:p>
+        </w:tc>
+      </w:tr>
+      <w:tr>
+        <w:tc>
+          <w:tcPr>
+            <w:tcW w:type="dxa" w:w="800"/>
+            <w:tcMar>
+              <w:top w:type="dxa" w:w="80"/>
+              <w:left w:type="dxa" w:w="100"/>
+              <w:bottom w:type="dxa" w:w="80"/>
+              <w:right w:type="dxa" w:w="100"/>
+            </w:tcMar>
+            <w:vAlign w:val="center"/>
+          </w:tcPr>
+          <w:p>
+            <w:pPr>
+              <w:jc w:val="left"/>
+            </w:pPr>
+            <w:r>
+              <w:rPr>
+                <w:rFonts w:ascii="Calibri" w:cs="Calibri" w:eastAsia="Calibri" w:hAnsi="Calibri"/>
+                <w:b w:val="false"/>
+                <w:bCs w:val="false"/>
+                <w:sz w:val="20"/>
+                <w:szCs w:val="20"/>
+              </w:rPr>
+              <w:t xml:space="preserve">F13</w:t>
+            </w:r>
+          </w:p>
+        </w:tc>
+        <w:tc>
+          <w:tcPr>
+            <w:tcW w:type="dxa" w:w="1900"/>
+            <w:tcMar>
+              <w:top w:type="dxa" w:w="80"/>
+              <w:left w:type="dxa" w:w="100"/>
+              <w:bottom w:type="dxa" w:w="80"/>
+              <w:right w:type="dxa" w:w="100"/>
+            </w:tcMar>
+            <w:vAlign w:val="center"/>
+          </w:tcPr>
+          <w:p>
+            <w:pPr>
+              <w:jc w:val="left"/>
+            </w:pPr>
+            <w:r>
+              <w:rPr>
+                <w:rFonts w:ascii="Calibri" w:cs="Calibri" w:eastAsia="Calibri" w:hAnsi="Calibri"/>
+                <w:b w:val="false"/>
+                <w:bCs w:val="false"/>
+                <w:sz w:val="20"/>
+                <w:szCs w:val="20"/>
+              </w:rPr>
+              <w:t xml:space="preserve">Khóa tài khoản tạm thời</w:t>
+            </w:r>
+          </w:p>
+        </w:tc>
+        <w:tc>
+          <w:tcPr>
+            <w:tcW w:type="dxa" w:w="4600"/>
+            <w:tcMar>
+              <w:top w:type="dxa" w:w="80"/>
+              <w:left w:type="dxa" w:w="100"/>
+              <w:bottom w:type="dxa" w:w="80"/>
+              <w:right w:type="dxa" w:w="100"/>
+            </w:tcMar>
+            <w:vAlign w:val="center"/>
+          </w:tcPr>
+          <w:p>
+            <w:pPr>
+              <w:jc w:val="left"/>
+            </w:pPr>
+            <w:r>
+              <w:rPr>
+                <w:rFonts w:ascii="Calibri" w:cs="Calibri" w:eastAsia="Calibri" w:hAnsi="Calibri"/>
+                <w:b w:val="false"/>
+                <w:bCs w:val="false"/>
+                <w:sz w:val="20"/>
+                <w:szCs w:val="20"/>
+              </w:rPr>
+              <w:t xml:space="preserve">Khóa 15 phút sau 5 lần đăng nhập sai liên tiếp, báo rõ thời gian còn lại (HTTP 423)</w:t>
+            </w:r>
+          </w:p>
+        </w:tc>
+        <w:tc>
+          <w:tcPr>
+            <w:tcW w:type="dxa" w:w="1240"/>
+            <w:tcMar>
+              <w:top w:type="dxa" w:w="80"/>
+              <w:left w:type="dxa" w:w="100"/>
+              <w:bottom w:type="dxa" w:w="80"/>
+              <w:right w:type="dxa" w:w="100"/>
+            </w:tcMar>
+            <w:vAlign w:val="center"/>
+          </w:tcPr>
+          <w:p>
+            <w:pPr>
+              <w:jc w:val="left"/>
+            </w:pPr>
+            <w:r>
+              <w:rPr>
+                <w:rFonts w:ascii="Calibri" w:cs="Calibri" w:eastAsia="Calibri" w:hAnsi="Calibri"/>
+                <w:b w:val="false"/>
+                <w:bCs w:val="false"/>
+                <w:sz w:val="20"/>
+                <w:szCs w:val="20"/>
+              </w:rPr>
+              <w:t xml:space="preserve">System</w:t>
+            </w:r>
+          </w:p>
+        </w:tc>
+        <w:tc>
+          <w:tcPr>
+            <w:tcW w:type="dxa" w:w="1900"/>
+            <w:tcMar>
+              <w:top w:type="dxa" w:w="80"/>
+              <w:left w:type="dxa" w:w="100"/>
+              <w:bottom w:type="dxa" w:w="80"/>
+              <w:right w:type="dxa" w:w="100"/>
+            </w:tcMar>
+            <w:vAlign w:val="center"/>
+          </w:tcPr>
+          <w:p>
+            <w:pPr>
+              <w:jc w:val="left"/>
+            </w:pPr>
+            <w:r>
+              <w:rPr>
+                <w:rFonts w:ascii="Calibri" w:cs="Calibri" w:eastAsia="Calibri" w:hAnsi="Calibri"/>
+                <w:b w:val="false"/>
+                <w:bCs w:val="false"/>
+                <w:sz w:val="20"/>
+                <w:szCs w:val="20"/>
+              </w:rPr>
+              <w:t xml:space="preserve">Bonus — bổ sung bảo mật</w:t>
+            </w:r>
+          </w:p>
+        </w:tc>
+      </w:tr>
+      <w:tr>
+        <w:tc>
+          <w:tcPr>
+            <w:tcW w:type="dxa" w:w="800"/>
+            <w:shd w:fill="F2F6FB" w:val="clear"/>
+            <w:tcMar>
+              <w:top w:type="dxa" w:w="80"/>
+              <w:left w:type="dxa" w:w="100"/>
+              <w:bottom w:type="dxa" w:w="80"/>
+              <w:right w:type="dxa" w:w="100"/>
+            </w:tcMar>
+            <w:vAlign w:val="center"/>
+          </w:tcPr>
+          <w:p>
+            <w:pPr>
+              <w:jc w:val="left"/>
+            </w:pPr>
+            <w:r>
+              <w:rPr>
+                <w:rFonts w:ascii="Calibri" w:cs="Calibri" w:eastAsia="Calibri" w:hAnsi="Calibri"/>
+                <w:b w:val="false"/>
+                <w:bCs w:val="false"/>
+                <w:sz w:val="20"/>
+                <w:szCs w:val="20"/>
+              </w:rPr>
+              <w:t xml:space="preserve">F14</w:t>
+            </w:r>
+          </w:p>
+        </w:tc>
+        <w:tc>
+          <w:tcPr>
+            <w:tcW w:type="dxa" w:w="1900"/>
+            <w:shd w:fill="F2F6FB" w:val="clear"/>
+            <w:tcMar>
+              <w:top w:type="dxa" w:w="80"/>
+              <w:left w:type="dxa" w:w="100"/>
+              <w:bottom w:type="dxa" w:w="80"/>
+              <w:right w:type="dxa" w:w="100"/>
+            </w:tcMar>
+            <w:vAlign w:val="center"/>
+          </w:tcPr>
+          <w:p>
+            <w:pPr>
+              <w:jc w:val="left"/>
+            </w:pPr>
+            <w:r>
+              <w:rPr>
+                <w:rFonts w:ascii="Calibri" w:cs="Calibri" w:eastAsia="Calibri" w:hAnsi="Calibri"/>
+                <w:b w:val="false"/>
+                <w:bCs w:val="false"/>
+                <w:sz w:val="20"/>
+                <w:szCs w:val="20"/>
+              </w:rPr>
+              <w:t xml:space="preserve">Xem chi tiết &amp; lịch sử thay đổi</w:t>
+            </w:r>
+          </w:p>
+        </w:tc>
+        <w:tc>
+          <w:tcPr>
+            <w:tcW w:type="dxa" w:w="4600"/>
+            <w:shd w:fill="F2F6FB" w:val="clear"/>
+            <w:tcMar>
+              <w:top w:type="dxa" w:w="80"/>
+              <w:left w:type="dxa" w:w="100"/>
+              <w:bottom w:type="dxa" w:w="80"/>
+              <w:right w:type="dxa" w:w="100"/>
+            </w:tcMar>
+            <w:vAlign w:val="center"/>
+          </w:tcPr>
+          <w:p>
+            <w:pPr>
+              <w:jc w:val="left"/>
+            </w:pPr>
+            <w:r>
+              <w:rPr>
+                <w:rFonts w:ascii="Calibri" w:cs="Calibri" w:eastAsia="Calibri" w:hAnsi="Calibri"/>
+                <w:b w:val="false"/>
+                <w:bCs w:val="false"/>
+                <w:sz w:val="20"/>
+                <w:szCs w:val="20"/>
+              </w:rPr>
+              <w:t xml:space="preserve">Trang chi tiết khách hàng kèm lịch sử Added/Modified/Deleted (giá trị cũ/mới, người thao tác, thời gian)</w:t>
+            </w:r>
+          </w:p>
+        </w:tc>
+        <w:tc>
+          <w:tcPr>
+            <w:tcW w:type="dxa" w:w="1240"/>
+            <w:shd w:fill="F2F6FB" w:val="clear"/>
+            <w:tcMar>
+              <w:top w:type="dxa" w:w="80"/>
+              <w:left w:type="dxa" w:w="100"/>
+              <w:bottom w:type="dxa" w:w="80"/>
+              <w:right w:type="dxa" w:w="100"/>
+            </w:tcMar>
+            <w:vAlign w:val="center"/>
+          </w:tcPr>
+          <w:p>
+            <w:pPr>
+              <w:jc w:val="left"/>
+            </w:pPr>
+            <w:r>
+              <w:rPr>
+                <w:rFonts w:ascii="Calibri" w:cs="Calibri" w:eastAsia="Calibri" w:hAnsi="Calibri"/>
+                <w:b w:val="false"/>
+                <w:bCs w:val="false"/>
+                <w:sz w:val="20"/>
+                <w:szCs w:val="20"/>
+              </w:rPr>
+              <w:t xml:space="preserve">Admin</w:t>
+            </w:r>
+          </w:p>
+        </w:tc>
+        <w:tc>
+          <w:tcPr>
+            <w:tcW w:type="dxa" w:w="1900"/>
+            <w:shd w:fill="F2F6FB" w:val="clear"/>
+            <w:tcMar>
+              <w:top w:type="dxa" w:w="80"/>
+              <w:left w:type="dxa" w:w="100"/>
+              <w:bottom w:type="dxa" w:w="80"/>
+              <w:right w:type="dxa" w:w="100"/>
+            </w:tcMar>
+            <w:vAlign w:val="center"/>
+          </w:tcPr>
+          <w:p>
+            <w:pPr>
+              <w:jc w:val="left"/>
+            </w:pPr>
+            <w:r>
+              <w:rPr>
+                <w:rFonts w:ascii="Calibri" w:cs="Calibri" w:eastAsia="Calibri" w:hAnsi="Calibri"/>
+                <w:b w:val="false"/>
+                <w:bCs w:val="false"/>
+                <w:sz w:val="20"/>
+                <w:szCs w:val="20"/>
+              </w:rPr>
+              <w:t xml:space="preserve">Should — bổ sung</w:t>
+            </w:r>
+          </w:p>
+        </w:tc>
+      </w:tr>
+      <w:tr>
+        <w:tc>
+          <w:tcPr>
+            <w:tcW w:type="dxa" w:w="800"/>
+            <w:tcMar>
+              <w:top w:type="dxa" w:w="80"/>
+              <w:left w:type="dxa" w:w="100"/>
+              <w:bottom w:type="dxa" w:w="80"/>
+              <w:right w:type="dxa" w:w="100"/>
+            </w:tcMar>
+            <w:vAlign w:val="center"/>
+          </w:tcPr>
+          <w:p>
+            <w:pPr>
+              <w:jc w:val="left"/>
+            </w:pPr>
+            <w:r>
+              <w:rPr>
+                <w:rFonts w:ascii="Calibri" w:cs="Calibri" w:eastAsia="Calibri" w:hAnsi="Calibri"/>
+                <w:b w:val="false"/>
+                <w:bCs w:val="false"/>
+                <w:sz w:val="20"/>
+                <w:szCs w:val="20"/>
+              </w:rPr>
+              <w:t xml:space="preserve">F15</w:t>
+            </w:r>
+          </w:p>
+        </w:tc>
+        <w:tc>
+          <w:tcPr>
+            <w:tcW w:type="dxa" w:w="1900"/>
+            <w:tcMar>
+              <w:top w:type="dxa" w:w="80"/>
+              <w:left w:type="dxa" w:w="100"/>
+              <w:bottom w:type="dxa" w:w="80"/>
+              <w:right w:type="dxa" w:w="100"/>
+            </w:tcMar>
+            <w:vAlign w:val="center"/>
+          </w:tcPr>
+          <w:p>
+            <w:pPr>
+              <w:jc w:val="left"/>
+            </w:pPr>
+            <w:r>
+              <w:rPr>
+                <w:rFonts w:ascii="Calibri" w:cs="Calibri" w:eastAsia="Calibri" w:hAnsi="Calibri"/>
+                <w:b w:val="false"/>
+                <w:bCs w:val="false"/>
+                <w:sz w:val="20"/>
+                <w:szCs w:val="20"/>
+              </w:rPr>
+              <w:t xml:space="preserve">Dashboard tổng quan</w:t>
+            </w:r>
+          </w:p>
+        </w:tc>
+        <w:tc>
+          <w:tcPr>
+            <w:tcW w:type="dxa" w:w="4600"/>
+            <w:tcMar>
+              <w:top w:type="dxa" w:w="80"/>
+              <w:left w:type="dxa" w:w="100"/>
+              <w:bottom w:type="dxa" w:w="80"/>
+              <w:right w:type="dxa" w:w="100"/>
+            </w:tcMar>
+            <w:vAlign w:val="center"/>
+          </w:tcPr>
+          <w:p>
+            <w:pPr>
+              <w:jc w:val="left"/>
+            </w:pPr>
+            <w:r>
+              <w:rPr>
+                <w:rFonts w:ascii="Calibri" w:cs="Calibri" w:eastAsia="Calibri" w:hAnsi="Calibri"/>
+                <w:b w:val="false"/>
+                <w:bCs w:val="false"/>
+                <w:sz w:val="20"/>
+                <w:szCs w:val="20"/>
+              </w:rPr>
+              <w:t xml:space="preserve">Thẻ KPI: tổng số khách hàng, đang hoạt động, ngừng hoạt động (số liệu thật từ API)</w:t>
+            </w:r>
+          </w:p>
+        </w:tc>
+        <w:tc>
+          <w:tcPr>
+            <w:tcW w:type="dxa" w:w="1240"/>
+            <w:tcMar>
+              <w:top w:type="dxa" w:w="80"/>
+              <w:left w:type="dxa" w:w="100"/>
+              <w:bottom w:type="dxa" w:w="80"/>
+              <w:right w:type="dxa" w:w="100"/>
+            </w:tcMar>
+            <w:vAlign w:val="center"/>
+          </w:tcPr>
+          <w:p>
+            <w:pPr>
+              <w:jc w:val="left"/>
+            </w:pPr>
+            <w:r>
+              <w:rPr>
+                <w:rFonts w:ascii="Calibri" w:cs="Calibri" w:eastAsia="Calibri" w:hAnsi="Calibri"/>
+                <w:b w:val="false"/>
+                <w:bCs w:val="false"/>
+                <w:sz w:val="20"/>
+                <w:szCs w:val="20"/>
+              </w:rPr>
+              <w:t xml:space="preserve">Admin</w:t>
+            </w:r>
+          </w:p>
+        </w:tc>
+        <w:tc>
+          <w:tcPr>
+            <w:tcW w:type="dxa" w:w="1900"/>
+            <w:tcMar>
+              <w:top w:type="dxa" w:w="80"/>
+              <w:left w:type="dxa" w:w="100"/>
+              <w:bottom w:type="dxa" w:w="80"/>
+              <w:right w:type="dxa" w:w="100"/>
+            </w:tcMar>
+            <w:vAlign w:val="center"/>
+          </w:tcPr>
+          <w:p>
+            <w:pPr>
+              <w:jc w:val="left"/>
+            </w:pPr>
+            <w:r>
+              <w:rPr>
+                <w:rFonts w:ascii="Calibri" w:cs="Calibri" w:eastAsia="Calibri" w:hAnsi="Calibri"/>
+                <w:b w:val="false"/>
+                <w:bCs w:val="false"/>
+                <w:sz w:val="20"/>
+                <w:szCs w:val="20"/>
+              </w:rPr>
+              <w:t xml:space="preserve">Could — bổ sung</w:t>
+            </w:r>
+          </w:p>
+        </w:tc>
+      </w:tr>
+      <w:tr>
+        <w:tc>
+          <w:tcPr>
+            <w:tcW w:type="dxa" w:w="800"/>
+            <w:shd w:fill="F2F6FB" w:val="clear"/>
+            <w:tcMar>
+              <w:top w:type="dxa" w:w="80"/>
+              <w:left w:type="dxa" w:w="100"/>
+              <w:bottom w:type="dxa" w:w="80"/>
+              <w:right w:type="dxa" w:w="100"/>
+            </w:tcMar>
+            <w:vAlign w:val="center"/>
+          </w:tcPr>
+          <w:p>
+            <w:pPr>
+              <w:jc w:val="left"/>
+            </w:pPr>
+            <w:r>
+              <w:rPr>
+                <w:rFonts w:ascii="Calibri" w:cs="Calibri" w:eastAsia="Calibri" w:hAnsi="Calibri"/>
+                <w:b w:val="false"/>
+                <w:bCs w:val="false"/>
+                <w:sz w:val="20"/>
+                <w:szCs w:val="20"/>
+              </w:rPr>
+              <w:t xml:space="preserve">F16</w:t>
+            </w:r>
+          </w:p>
+        </w:tc>
+        <w:tc>
+          <w:tcPr>
+            <w:tcW w:type="dxa" w:w="1900"/>
+            <w:shd w:fill="F2F6FB" w:val="clear"/>
+            <w:tcMar>
+              <w:top w:type="dxa" w:w="80"/>
+              <w:left w:type="dxa" w:w="100"/>
+              <w:bottom w:type="dxa" w:w="80"/>
+              <w:right w:type="dxa" w:w="100"/>
+            </w:tcMar>
+            <w:vAlign w:val="center"/>
+          </w:tcPr>
+          <w:p>
+            <w:pPr>
+              <w:jc w:val="left"/>
+            </w:pPr>
+            <w:r>
+              <w:rPr>
+                <w:rFonts w:ascii="Calibri" w:cs="Calibri" w:eastAsia="Calibri" w:hAnsi="Calibri"/>
+                <w:b w:val="false"/>
+                <w:bCs w:val="false"/>
+                <w:sz w:val="20"/>
+                <w:szCs w:val="20"/>
+              </w:rPr>
+              <w:t xml:space="preserve">Xóa hàng loạt &amp; Command Palette</w:t>
+            </w:r>
+          </w:p>
+        </w:tc>
+        <w:tc>
+          <w:tcPr>
+            <w:tcW w:type="dxa" w:w="4600"/>
+            <w:shd w:fill="F2F6FB" w:val="clear"/>
+            <w:tcMar>
+              <w:top w:type="dxa" w:w="80"/>
+              <w:left w:type="dxa" w:w="100"/>
+              <w:bottom w:type="dxa" w:w="80"/>
+              <w:right w:type="dxa" w:w="100"/>
+            </w:tcMar>
+            <w:vAlign w:val="center"/>
+          </w:tcPr>
+          <w:p>
+            <w:pPr>
+              <w:jc w:val="left"/>
+            </w:pPr>
+            <w:r>
+              <w:rPr>
+                <w:rFonts w:ascii="Calibri" w:cs="Calibri" w:eastAsia="Calibri" w:hAnsi="Calibri"/>
+                <w:b w:val="false"/>
+                <w:bCs w:val="false"/>
+                <w:sz w:val="20"/>
+                <w:szCs w:val="20"/>
+              </w:rPr>
+              <w:t xml:space="preserve">Chọn nhiều dòng để xóa mềm cùng lúc; Ctrl+K để điều hướng/thao tác nhanh; dark mode</w:t>
+            </w:r>
+          </w:p>
+        </w:tc>
+        <w:tc>
+          <w:tcPr>
+            <w:tcW w:type="dxa" w:w="1240"/>
+            <w:shd w:fill="F2F6FB" w:val="clear"/>
+            <w:tcMar>
+              <w:top w:type="dxa" w:w="80"/>
+              <w:left w:type="dxa" w:w="100"/>
+              <w:bottom w:type="dxa" w:w="80"/>
+              <w:right w:type="dxa" w:w="100"/>
+            </w:tcMar>
+            <w:vAlign w:val="center"/>
+          </w:tcPr>
+          <w:p>
+            <w:pPr>
+              <w:jc w:val="left"/>
+            </w:pPr>
+            <w:r>
+              <w:rPr>
+                <w:rFonts w:ascii="Calibri" w:cs="Calibri" w:eastAsia="Calibri" w:hAnsi="Calibri"/>
+                <w:b w:val="false"/>
+                <w:bCs w:val="false"/>
+                <w:sz w:val="20"/>
+                <w:szCs w:val="20"/>
+              </w:rPr>
+              <w:t xml:space="preserve">Admin</w:t>
+            </w:r>
+          </w:p>
+        </w:tc>
+        <w:tc>
+          <w:tcPr>
+            <w:tcW w:type="dxa" w:w="1900"/>
+            <w:shd w:fill="F2F6FB" w:val="clear"/>
+            <w:tcMar>
+              <w:top w:type="dxa" w:w="80"/>
+              <w:left w:type="dxa" w:w="100"/>
+              <w:bottom w:type="dxa" w:w="80"/>
+              <w:right w:type="dxa" w:w="100"/>
+            </w:tcMar>
+            <w:vAlign w:val="center"/>
+          </w:tcPr>
+          <w:p>
+            <w:pPr>
+              <w:jc w:val="left"/>
+            </w:pPr>
+            <w:r>
+              <w:rPr>
+                <w:rFonts w:ascii="Calibri" w:cs="Calibri" w:eastAsia="Calibri" w:hAnsi="Calibri"/>
+                <w:b w:val="false"/>
+                <w:bCs w:val="false"/>
+                <w:sz w:val="20"/>
+                <w:szCs w:val="20"/>
+              </w:rPr>
+              <w:t xml:space="preserve">Could — bổ sung</w:t>
             </w:r>
           </w:p>
         </w:tc>
@@ -1815,7 +2528,7 @@
           <w:sz w:val="22"/>
           <w:szCs w:val="22"/>
         </w:rPr>
-        <w:t xml:space="preserve">Hệ thống có 4 màn hình/thành phần giao diện chính, gồm 2 trang định tuyến riêng (Login, Danh sách khách hàng) và 2 dialog dùng chung một luồng thao tác (Thêm/Sửa gộp chung 1 dialog theo 2 chế độ, Xác nhận xóa). Việc gộp Thêm/Sửa/Xem-chi-tiết vào chung 1 dialog (thay vì tách route riêng cho từng thao tác) giúp giảm số màn hình không cần thiết, giữ luồng thao tác liền mạch cho admin.</w:t>
+        <w:t xml:space="preserve">Hệ thống có 7 màn hình/thành phần giao diện chính: 4 trang định tuyến riêng (Đăng nhập, Dashboard, Danh sách khách hàng, Chi tiết khách hàng), 2 dialog (Thêm/Sửa gộp chung 1 dialog theo 2 chế độ, Xác nhận xóa) và 1 overlay Command Palette. Bản phân tích ban đầu dự kiến 4 màn hình và gộp Xem chi tiết vào dialog; khi triển khai, Xem chi tiết được tách thành trang riêng vì cần hiển thị thêm lịch sử thay đổi — quá dài cho một dialog. Dashboard và Command Palette được bổ sung để hoàn thiện trải nghiệm quản trị.</w:t>
       </w:r>
     </w:p>
     <w:tbl>
@@ -2062,7 +2775,7 @@
                 <w:sz w:val="20"/>
                 <w:szCs w:val="20"/>
               </w:rPr>
-              <w:t xml:space="preserve">Form Username/Password, gọi POST /api/auth/login, hiển thị lỗi 401 rõ ràng</w:t>
+              <w:t xml:space="preserve">Form Username/Password, ẩn/hiện mật khẩu, ghi nhớ username; gọi POST /api/auth/login, hiển thị lỗi 401 hoặc thông báo khóa tài khoản (423)</w:t>
             </w:r>
           </w:p>
         </w:tc>
@@ -2120,7 +2833,7 @@
                 <w:sz w:val="20"/>
                 <w:szCs w:val="20"/>
               </w:rPr>
-              <w:t xml:space="preserve">Danh sách khách hàng (Dashboard)</w:t>
+              <w:t xml:space="preserve">Dashboard</w:t>
             </w:r>
           </w:p>
         </w:tc>
@@ -2148,7 +2861,7 @@
                 <w:sz w:val="20"/>
                 <w:szCs w:val="20"/>
               </w:rPr>
-              <w:t xml:space="preserve">Trang (route riêng: /customers)</w:t>
+              <w:t xml:space="preserve">Trang (route riêng: /)</w:t>
             </w:r>
           </w:p>
         </w:tc>
@@ -2176,7 +2889,7 @@
                 <w:sz w:val="20"/>
                 <w:szCs w:val="20"/>
               </w:rPr>
-              <w:t xml:space="preserve">MudDataGrid server-side, ô tìm kiếm + bộ lọc trạng thái, nút Thêm mới, action Sửa/Xóa trên mỗi dòng</w:t>
+              <w:t xml:space="preserve">Thẻ KPI tổng số / đang hoạt động / ngừng hoạt động, lấy từ GET /api/customers (pageSize=1, đọc totalCount)</w:t>
             </w:r>
           </w:p>
         </w:tc>
@@ -2232,7 +2945,7 @@
                 <w:sz w:val="20"/>
                 <w:szCs w:val="20"/>
               </w:rPr>
-              <w:t xml:space="preserve">Thêm mới / Cập nhật khách hàng</w:t>
+              <w:t xml:space="preserve">Danh sách khách hàng</w:t>
             </w:r>
           </w:p>
         </w:tc>
@@ -2259,7 +2972,7 @@
                 <w:sz w:val="20"/>
                 <w:szCs w:val="20"/>
               </w:rPr>
-              <w:t xml:space="preserve">Dialog (MudDialog, dùng chung 1 component 2 chế độ Create/Edit)</w:t>
+              <w:t xml:space="preserve">Trang (route riêng: /customers)</w:t>
             </w:r>
           </w:p>
         </w:tc>
@@ -2286,7 +2999,7 @@
                 <w:sz w:val="20"/>
                 <w:szCs w:val="20"/>
               </w:rPr>
-              <w:t xml:space="preserve">Form nhập liệu + validate client-side, hiển thị lỗi field-level, disable khi đang lưu</w:t>
+              <w:t xml:space="preserve">MudDataGrid server-side, ô tìm kiếm Họ tên/SĐT + Filter Drawer trạng thái, nút Thêm, action Xem/Sửa/Xóa, chọn nhiều dòng để xóa hàng loạt, card view trên mobile</w:t>
             </w:r>
           </w:p>
         </w:tc>
@@ -2344,6 +3057,230 @@
                 <w:sz w:val="20"/>
                 <w:szCs w:val="20"/>
               </w:rPr>
+              <w:t xml:space="preserve">Chi tiết khách hàng</w:t>
+            </w:r>
+          </w:p>
+        </w:tc>
+        <w:tc>
+          <w:tcPr>
+            <w:tcW w:type="dxa" w:w="2830"/>
+            <w:shd w:fill="F2F6FB" w:val="clear"/>
+            <w:tcMar>
+              <w:top w:type="dxa" w:w="80"/>
+              <w:left w:type="dxa" w:w="100"/>
+              <w:bottom w:type="dxa" w:w="80"/>
+              <w:right w:type="dxa" w:w="100"/>
+            </w:tcMar>
+            <w:vAlign w:val="center"/>
+          </w:tcPr>
+          <w:p>
+            <w:pPr>
+              <w:jc w:val="left"/>
+            </w:pPr>
+            <w:r>
+              <w:rPr>
+                <w:rFonts w:ascii="Calibri" w:cs="Calibri" w:eastAsia="Calibri" w:hAnsi="Calibri"/>
+                <w:b w:val="false"/>
+                <w:bCs w:val="false"/>
+                <w:sz w:val="20"/>
+                <w:szCs w:val="20"/>
+              </w:rPr>
+              <w:t xml:space="preserve">Trang (route riêng: /customers/{id})</w:t>
+            </w:r>
+          </w:p>
+        </w:tc>
+        <w:tc>
+          <w:tcPr>
+            <w:tcW w:type="dxa" w:w="4510"/>
+            <w:shd w:fill="F2F6FB" w:val="clear"/>
+            <w:tcMar>
+              <w:top w:type="dxa" w:w="80"/>
+              <w:left w:type="dxa" w:w="100"/>
+              <w:bottom w:type="dxa" w:w="80"/>
+              <w:right w:type="dxa" w:w="100"/>
+            </w:tcMar>
+            <w:vAlign w:val="center"/>
+          </w:tcPr>
+          <w:p>
+            <w:pPr>
+              <w:jc w:val="left"/>
+            </w:pPr>
+            <w:r>
+              <w:rPr>
+                <w:rFonts w:ascii="Calibri" w:cs="Calibri" w:eastAsia="Calibri" w:hAnsi="Calibri"/>
+                <w:b w:val="false"/>
+                <w:bCs w:val="false"/>
+                <w:sz w:val="20"/>
+                <w:szCs w:val="20"/>
+              </w:rPr>
+              <w:t xml:space="preserve">Thông tin đầy đủ, người tạo/sửa; mục "Lịch sử thay đổi" (MudExpansionPanels, so sánh cũ/mới) gọi GET /api/customers/{id}/audit-logs</w:t>
+            </w:r>
+          </w:p>
+        </w:tc>
+      </w:tr>
+      <w:tr>
+        <w:tc>
+          <w:tcPr>
+            <w:tcW w:type="dxa" w:w="450"/>
+            <w:tcMar>
+              <w:top w:type="dxa" w:w="80"/>
+              <w:left w:type="dxa" w:w="100"/>
+              <w:bottom w:type="dxa" w:w="80"/>
+              <w:right w:type="dxa" w:w="100"/>
+            </w:tcMar>
+            <w:vAlign w:val="center"/>
+          </w:tcPr>
+          <w:p>
+            <w:pPr>
+              <w:jc w:val="left"/>
+            </w:pPr>
+            <w:r>
+              <w:rPr>
+                <w:rFonts w:ascii="Calibri" w:cs="Calibri" w:eastAsia="Calibri" w:hAnsi="Calibri"/>
+                <w:b w:val="false"/>
+                <w:bCs w:val="false"/>
+                <w:sz w:val="20"/>
+                <w:szCs w:val="20"/>
+              </w:rPr>
+              <w:t xml:space="preserve">5</w:t>
+            </w:r>
+          </w:p>
+        </w:tc>
+        <w:tc>
+          <w:tcPr>
+            <w:tcW w:type="dxa" w:w="2650"/>
+            <w:tcMar>
+              <w:top w:type="dxa" w:w="80"/>
+              <w:left w:type="dxa" w:w="100"/>
+              <w:bottom w:type="dxa" w:w="80"/>
+              <w:right w:type="dxa" w:w="100"/>
+            </w:tcMar>
+            <w:vAlign w:val="center"/>
+          </w:tcPr>
+          <w:p>
+            <w:pPr>
+              <w:jc w:val="left"/>
+            </w:pPr>
+            <w:r>
+              <w:rPr>
+                <w:rFonts w:ascii="Calibri" w:cs="Calibri" w:eastAsia="Calibri" w:hAnsi="Calibri"/>
+                <w:b w:val="false"/>
+                <w:bCs w:val="false"/>
+                <w:sz w:val="20"/>
+                <w:szCs w:val="20"/>
+              </w:rPr>
+              <w:t xml:space="preserve">Thêm mới / Cập nhật khách hàng</w:t>
+            </w:r>
+          </w:p>
+        </w:tc>
+        <w:tc>
+          <w:tcPr>
+            <w:tcW w:type="dxa" w:w="2830"/>
+            <w:tcMar>
+              <w:top w:type="dxa" w:w="80"/>
+              <w:left w:type="dxa" w:w="100"/>
+              <w:bottom w:type="dxa" w:w="80"/>
+              <w:right w:type="dxa" w:w="100"/>
+            </w:tcMar>
+            <w:vAlign w:val="center"/>
+          </w:tcPr>
+          <w:p>
+            <w:pPr>
+              <w:jc w:val="left"/>
+            </w:pPr>
+            <w:r>
+              <w:rPr>
+                <w:rFonts w:ascii="Calibri" w:cs="Calibri" w:eastAsia="Calibri" w:hAnsi="Calibri"/>
+                <w:b w:val="false"/>
+                <w:bCs w:val="false"/>
+                <w:sz w:val="20"/>
+                <w:szCs w:val="20"/>
+              </w:rPr>
+              <w:t xml:space="preserve">Dialog (MudDialog, dùng chung 1 component 2 chế độ Create/Edit)</w:t>
+            </w:r>
+          </w:p>
+        </w:tc>
+        <w:tc>
+          <w:tcPr>
+            <w:tcW w:type="dxa" w:w="4510"/>
+            <w:tcMar>
+              <w:top w:type="dxa" w:w="80"/>
+              <w:left w:type="dxa" w:w="100"/>
+              <w:bottom w:type="dxa" w:w="80"/>
+              <w:right w:type="dxa" w:w="100"/>
+            </w:tcMar>
+            <w:vAlign w:val="center"/>
+          </w:tcPr>
+          <w:p>
+            <w:pPr>
+              <w:jc w:val="left"/>
+            </w:pPr>
+            <w:r>
+              <w:rPr>
+                <w:rFonts w:ascii="Calibri" w:cs="Calibri" w:eastAsia="Calibri" w:hAnsi="Calibri"/>
+                <w:b w:val="false"/>
+                <w:bCs w:val="false"/>
+                <w:sz w:val="20"/>
+                <w:szCs w:val="20"/>
+              </w:rPr>
+              <w:t xml:space="preserve">Form nhập liệu + validate client-side, hiển thị lỗi field-level, disable khi đang lưu</w:t>
+            </w:r>
+          </w:p>
+        </w:tc>
+      </w:tr>
+      <w:tr>
+        <w:tc>
+          <w:tcPr>
+            <w:tcW w:type="dxa" w:w="450"/>
+            <w:shd w:fill="F2F6FB" w:val="clear"/>
+            <w:tcMar>
+              <w:top w:type="dxa" w:w="80"/>
+              <w:left w:type="dxa" w:w="100"/>
+              <w:bottom w:type="dxa" w:w="80"/>
+              <w:right w:type="dxa" w:w="100"/>
+            </w:tcMar>
+            <w:vAlign w:val="center"/>
+          </w:tcPr>
+          <w:p>
+            <w:pPr>
+              <w:jc w:val="left"/>
+            </w:pPr>
+            <w:r>
+              <w:rPr>
+                <w:rFonts w:ascii="Calibri" w:cs="Calibri" w:eastAsia="Calibri" w:hAnsi="Calibri"/>
+                <w:b w:val="false"/>
+                <w:bCs w:val="false"/>
+                <w:sz w:val="20"/>
+                <w:szCs w:val="20"/>
+              </w:rPr>
+              <w:t xml:space="preserve">6</w:t>
+            </w:r>
+          </w:p>
+        </w:tc>
+        <w:tc>
+          <w:tcPr>
+            <w:tcW w:type="dxa" w:w="2650"/>
+            <w:shd w:fill="F2F6FB" w:val="clear"/>
+            <w:tcMar>
+              <w:top w:type="dxa" w:w="80"/>
+              <w:left w:type="dxa" w:w="100"/>
+              <w:bottom w:type="dxa" w:w="80"/>
+              <w:right w:type="dxa" w:w="100"/>
+            </w:tcMar>
+            <w:vAlign w:val="center"/>
+          </w:tcPr>
+          <w:p>
+            <w:pPr>
+              <w:jc w:val="left"/>
+            </w:pPr>
+            <w:r>
+              <w:rPr>
+                <w:rFonts w:ascii="Calibri" w:cs="Calibri" w:eastAsia="Calibri" w:hAnsi="Calibri"/>
+                <w:b w:val="false"/>
+                <w:bCs w:val="false"/>
+                <w:sz w:val="20"/>
+                <w:szCs w:val="20"/>
+              </w:rPr>
               <w:t xml:space="preserve">Xác nhận xóa khách hàng</w:t>
             </w:r>
           </w:p>
@@ -2401,6 +3338,116 @@
                 <w:szCs w:val="20"/>
               </w:rPr>
               <w:t xml:space="preserve">Xác nhận trước khi gọi DELETE, tránh xóa nhầm</w:t>
+            </w:r>
+          </w:p>
+        </w:tc>
+      </w:tr>
+      <w:tr>
+        <w:tc>
+          <w:tcPr>
+            <w:tcW w:type="dxa" w:w="450"/>
+            <w:tcMar>
+              <w:top w:type="dxa" w:w="80"/>
+              <w:left w:type="dxa" w:w="100"/>
+              <w:bottom w:type="dxa" w:w="80"/>
+              <w:right w:type="dxa" w:w="100"/>
+            </w:tcMar>
+            <w:vAlign w:val="center"/>
+          </w:tcPr>
+          <w:p>
+            <w:pPr>
+              <w:jc w:val="left"/>
+            </w:pPr>
+            <w:r>
+              <w:rPr>
+                <w:rFonts w:ascii="Calibri" w:cs="Calibri" w:eastAsia="Calibri" w:hAnsi="Calibri"/>
+                <w:b w:val="false"/>
+                <w:bCs w:val="false"/>
+                <w:sz w:val="20"/>
+                <w:szCs w:val="20"/>
+              </w:rPr>
+              <w:t xml:space="preserve">7</w:t>
+            </w:r>
+          </w:p>
+        </w:tc>
+        <w:tc>
+          <w:tcPr>
+            <w:tcW w:type="dxa" w:w="2650"/>
+            <w:tcMar>
+              <w:top w:type="dxa" w:w="80"/>
+              <w:left w:type="dxa" w:w="100"/>
+              <w:bottom w:type="dxa" w:w="80"/>
+              <w:right w:type="dxa" w:w="100"/>
+            </w:tcMar>
+            <w:vAlign w:val="center"/>
+          </w:tcPr>
+          <w:p>
+            <w:pPr>
+              <w:jc w:val="left"/>
+            </w:pPr>
+            <w:r>
+              <w:rPr>
+                <w:rFonts w:ascii="Calibri" w:cs="Calibri" w:eastAsia="Calibri" w:hAnsi="Calibri"/>
+                <w:b w:val="false"/>
+                <w:bCs w:val="false"/>
+                <w:sz w:val="20"/>
+                <w:szCs w:val="20"/>
+              </w:rPr>
+              <w:t xml:space="preserve">Command Palette</w:t>
+            </w:r>
+          </w:p>
+        </w:tc>
+        <w:tc>
+          <w:tcPr>
+            <w:tcW w:type="dxa" w:w="2830"/>
+            <w:tcMar>
+              <w:top w:type="dxa" w:w="80"/>
+              <w:left w:type="dxa" w:w="100"/>
+              <w:bottom w:type="dxa" w:w="80"/>
+              <w:right w:type="dxa" w:w="100"/>
+            </w:tcMar>
+            <w:vAlign w:val="center"/>
+          </w:tcPr>
+          <w:p>
+            <w:pPr>
+              <w:jc w:val="left"/>
+            </w:pPr>
+            <w:r>
+              <w:rPr>
+                <w:rFonts w:ascii="Calibri" w:cs="Calibri" w:eastAsia="Calibri" w:hAnsi="Calibri"/>
+                <w:b w:val="false"/>
+                <w:bCs w:val="false"/>
+                <w:sz w:val="20"/>
+                <w:szCs w:val="20"/>
+              </w:rPr>
+              <w:t xml:space="preserve">Overlay (phím tắt Ctrl+K)</w:t>
+            </w:r>
+          </w:p>
+        </w:tc>
+        <w:tc>
+          <w:tcPr>
+            <w:tcW w:type="dxa" w:w="4510"/>
+            <w:tcMar>
+              <w:top w:type="dxa" w:w="80"/>
+              <w:left w:type="dxa" w:w="100"/>
+              <w:bottom w:type="dxa" w:w="80"/>
+              <w:right w:type="dxa" w:w="100"/>
+            </w:tcMar>
+            <w:vAlign w:val="center"/>
+          </w:tcPr>
+          <w:p>
+            <w:pPr>
+              <w:jc w:val="left"/>
+            </w:pPr>
+            <w:r>
+              <w:rPr>
+                <w:rFonts w:ascii="Calibri" w:cs="Calibri" w:eastAsia="Calibri" w:hAnsi="Calibri"/>
+                <w:b w:val="false"/>
+                <w:bCs w:val="false"/>
+                <w:sz w:val="20"/>
+                <w:szCs w:val="20"/>
+              </w:rPr>
+              <w:t xml:space="preserve">Điều hướng nhanh: Dashboard, Khách hàng, Thêm khách hàng, đổi chế độ sáng/tối, Đăng xuất</w:t>
             </w:r>
           </w:p>
         </w:tc>
@@ -2425,7 +3472,7 @@
           <w:sz w:val="22"/>
           <w:szCs w:val="22"/>
         </w:rPr>
-        <w:t xml:space="preserve">Cơ sở dữ liệu gồm 2 bảng: Users (tài khoản admin) và Customers (dữ liệu nghiệp vụ chính). Không có bảng phụ nào khác — không cần bảng log lịch sử thay đổi riêng ở quy mô Mini Project này (audit tối thiểu CreatedBy/UpdatedBy trên chính bảng Customers là đủ, xem mục 2.5).</w:t>
+        <w:t xml:space="preserve">Cơ sở dữ liệu gồm 4 bảng: Users (tài khoản admin), Customers (dữ liệu nghiệp vụ chính), RefreshTokens (phiên đăng nhập) và AuditLogs (lịch sử thay đổi). Bản phân tích ban đầu chỉ có Users và Customers; RefreshTokens và AuditLogs được bổ sung khi triển khai (migration AddRefreshTokenAndLockout, AddAuditLogs) để tăng cường bảo mật phiên và đáp ứng yêu cầu truy vết đầy đủ của hệ thống tài chính. Schema được tạo bằng 3 migration EF Core Code First; kiểu dữ liệu dưới đây lấy theo migration thực tế.</w:t>
       </w:r>
     </w:p>
     <w:p>
@@ -2796,7 +3843,7 @@
                 <w:sz w:val="20"/>
                 <w:szCs w:val="20"/>
               </w:rPr>
-              <w:t xml:space="preserve">varchar(50)</w:t>
+              <w:t xml:space="preserve">nvarchar(50)</w:t>
             </w:r>
           </w:p>
         </w:tc>
@@ -3160,6 +4207,285 @@
                 <w:szCs w:val="20"/>
               </w:rPr>
               <w:t xml:space="preserve">UTC</w:t>
+            </w:r>
+          </w:p>
+        </w:tc>
+      </w:tr>
+      <w:tr>
+        <w:tc>
+          <w:tcPr>
+            <w:tcW w:type="dxa" w:w="1650"/>
+            <w:tcMar>
+              <w:top w:type="dxa" w:w="80"/>
+              <w:left w:type="dxa" w:w="100"/>
+              <w:bottom w:type="dxa" w:w="80"/>
+              <w:right w:type="dxa" w:w="100"/>
+            </w:tcMar>
+            <w:vAlign w:val="center"/>
+          </w:tcPr>
+          <w:p>
+            <w:pPr>
+              <w:jc w:val="left"/>
+            </w:pPr>
+            <w:r>
+              <w:rPr>
+                <w:rFonts w:ascii="Calibri" w:cs="Calibri" w:eastAsia="Calibri" w:hAnsi="Calibri"/>
+                <w:b w:val="false"/>
+                <w:bCs w:val="false"/>
+                <w:sz w:val="20"/>
+                <w:szCs w:val="20"/>
+              </w:rPr>
+              <w:t xml:space="preserve">FailedLoginAttempts</w:t>
+            </w:r>
+          </w:p>
+        </w:tc>
+        <w:tc>
+          <w:tcPr>
+            <w:tcW w:type="dxa" w:w="1650"/>
+            <w:tcMar>
+              <w:top w:type="dxa" w:w="80"/>
+              <w:left w:type="dxa" w:w="100"/>
+              <w:bottom w:type="dxa" w:w="80"/>
+              <w:right w:type="dxa" w:w="100"/>
+            </w:tcMar>
+            <w:vAlign w:val="center"/>
+          </w:tcPr>
+          <w:p>
+            <w:pPr>
+              <w:jc w:val="left"/>
+            </w:pPr>
+            <w:r>
+              <w:rPr>
+                <w:rFonts w:ascii="Calibri" w:cs="Calibri" w:eastAsia="Calibri" w:hAnsi="Calibri"/>
+                <w:b w:val="false"/>
+                <w:bCs w:val="false"/>
+                <w:sz w:val="20"/>
+                <w:szCs w:val="20"/>
+              </w:rPr>
+              <w:t xml:space="preserve">int</w:t>
+            </w:r>
+          </w:p>
+        </w:tc>
+        <w:tc>
+          <w:tcPr>
+            <w:tcW w:type="dxa" w:w="1100"/>
+            <w:tcMar>
+              <w:top w:type="dxa" w:w="80"/>
+              <w:left w:type="dxa" w:w="100"/>
+              <w:bottom w:type="dxa" w:w="80"/>
+              <w:right w:type="dxa" w:w="100"/>
+            </w:tcMar>
+            <w:vAlign w:val="center"/>
+          </w:tcPr>
+          <w:p>
+            <w:pPr>
+              <w:jc w:val="left"/>
+            </w:pPr>
+            <w:r>
+              <w:rPr>
+                <w:rFonts w:ascii="Calibri" w:cs="Calibri" w:eastAsia="Calibri" w:hAnsi="Calibri"/>
+                <w:b w:val="false"/>
+                <w:bCs w:val="false"/>
+                <w:sz w:val="20"/>
+                <w:szCs w:val="20"/>
+              </w:rPr>
+              <w:t xml:space="preserve">Không</w:t>
+            </w:r>
+          </w:p>
+        </w:tc>
+        <w:tc>
+          <w:tcPr>
+            <w:tcW w:type="dxa" w:w="2010"/>
+            <w:tcMar>
+              <w:top w:type="dxa" w:w="80"/>
+              <w:left w:type="dxa" w:w="100"/>
+              <w:bottom w:type="dxa" w:w="80"/>
+              <w:right w:type="dxa" w:w="100"/>
+            </w:tcMar>
+            <w:vAlign w:val="center"/>
+          </w:tcPr>
+          <w:p>
+            <w:pPr>
+              <w:jc w:val="left"/>
+            </w:pPr>
+            <w:r>
+              <w:rPr>
+                <w:rFonts w:ascii="Calibri" w:cs="Calibri" w:eastAsia="Calibri" w:hAnsi="Calibri"/>
+                <w:b w:val="false"/>
+                <w:bCs w:val="false"/>
+                <w:sz w:val="20"/>
+                <w:szCs w:val="20"/>
+              </w:rPr>
+              <w:t xml:space="preserve">—</w:t>
+            </w:r>
+          </w:p>
+        </w:tc>
+        <w:tc>
+          <w:tcPr>
+            <w:tcW w:type="dxa" w:w="4030"/>
+            <w:tcMar>
+              <w:top w:type="dxa" w:w="80"/>
+              <w:left w:type="dxa" w:w="100"/>
+              <w:bottom w:type="dxa" w:w="80"/>
+              <w:right w:type="dxa" w:w="100"/>
+            </w:tcMar>
+            <w:vAlign w:val="center"/>
+          </w:tcPr>
+          <w:p>
+            <w:pPr>
+              <w:jc w:val="left"/>
+            </w:pPr>
+            <w:r>
+              <w:rPr>
+                <w:rFonts w:ascii="Calibri" w:cs="Calibri" w:eastAsia="Calibri" w:hAnsi="Calibri"/>
+                <w:b w:val="false"/>
+                <w:bCs w:val="false"/>
+                <w:sz w:val="20"/>
+                <w:szCs w:val="20"/>
+              </w:rPr>
+              <w:t xml:space="preserve">Số lần đăng nhập sai liên tiếp, mặc định 0, reset khi đăng nhập đúng (bổ sung)</w:t>
+            </w:r>
+          </w:p>
+        </w:tc>
+      </w:tr>
+      <w:tr>
+        <w:tc>
+          <w:tcPr>
+            <w:tcW w:type="dxa" w:w="1650"/>
+            <w:shd w:fill="F2F6FB" w:val="clear"/>
+            <w:tcMar>
+              <w:top w:type="dxa" w:w="80"/>
+              <w:left w:type="dxa" w:w="100"/>
+              <w:bottom w:type="dxa" w:w="80"/>
+              <w:right w:type="dxa" w:w="100"/>
+            </w:tcMar>
+            <w:vAlign w:val="center"/>
+          </w:tcPr>
+          <w:p>
+            <w:pPr>
+              <w:jc w:val="left"/>
+            </w:pPr>
+            <w:r>
+              <w:rPr>
+                <w:rFonts w:ascii="Calibri" w:cs="Calibri" w:eastAsia="Calibri" w:hAnsi="Calibri"/>
+                <w:b w:val="false"/>
+                <w:bCs w:val="false"/>
+                <w:sz w:val="20"/>
+                <w:szCs w:val="20"/>
+              </w:rPr>
+              <w:t xml:space="preserve">LockedOutUntil</w:t>
+            </w:r>
+          </w:p>
+        </w:tc>
+        <w:tc>
+          <w:tcPr>
+            <w:tcW w:type="dxa" w:w="1650"/>
+            <w:shd w:fill="F2F6FB" w:val="clear"/>
+            <w:tcMar>
+              <w:top w:type="dxa" w:w="80"/>
+              <w:left w:type="dxa" w:w="100"/>
+              <w:bottom w:type="dxa" w:w="80"/>
+              <w:right w:type="dxa" w:w="100"/>
+            </w:tcMar>
+            <w:vAlign w:val="center"/>
+          </w:tcPr>
+          <w:p>
+            <w:pPr>
+              <w:jc w:val="left"/>
+            </w:pPr>
+            <w:r>
+              <w:rPr>
+                <w:rFonts w:ascii="Calibri" w:cs="Calibri" w:eastAsia="Calibri" w:hAnsi="Calibri"/>
+                <w:b w:val="false"/>
+                <w:bCs w:val="false"/>
+                <w:sz w:val="20"/>
+                <w:szCs w:val="20"/>
+              </w:rPr>
+              <w:t xml:space="preserve">datetime2</w:t>
+            </w:r>
+          </w:p>
+        </w:tc>
+        <w:tc>
+          <w:tcPr>
+            <w:tcW w:type="dxa" w:w="1100"/>
+            <w:shd w:fill="F2F6FB" w:val="clear"/>
+            <w:tcMar>
+              <w:top w:type="dxa" w:w="80"/>
+              <w:left w:type="dxa" w:w="100"/>
+              <w:bottom w:type="dxa" w:w="80"/>
+              <w:right w:type="dxa" w:w="100"/>
+            </w:tcMar>
+            <w:vAlign w:val="center"/>
+          </w:tcPr>
+          <w:p>
+            <w:pPr>
+              <w:jc w:val="left"/>
+            </w:pPr>
+            <w:r>
+              <w:rPr>
+                <w:rFonts w:ascii="Calibri" w:cs="Calibri" w:eastAsia="Calibri" w:hAnsi="Calibri"/>
+                <w:b w:val="false"/>
+                <w:bCs w:val="false"/>
+                <w:sz w:val="20"/>
+                <w:szCs w:val="20"/>
+              </w:rPr>
+              <w:t xml:space="preserve">Có</w:t>
+            </w:r>
+          </w:p>
+        </w:tc>
+        <w:tc>
+          <w:tcPr>
+            <w:tcW w:type="dxa" w:w="2010"/>
+            <w:shd w:fill="F2F6FB" w:val="clear"/>
+            <w:tcMar>
+              <w:top w:type="dxa" w:w="80"/>
+              <w:left w:type="dxa" w:w="100"/>
+              <w:bottom w:type="dxa" w:w="80"/>
+              <w:right w:type="dxa" w:w="100"/>
+            </w:tcMar>
+            <w:vAlign w:val="center"/>
+          </w:tcPr>
+          <w:p>
+            <w:pPr>
+              <w:jc w:val="left"/>
+            </w:pPr>
+            <w:r>
+              <w:rPr>
+                <w:rFonts w:ascii="Calibri" w:cs="Calibri" w:eastAsia="Calibri" w:hAnsi="Calibri"/>
+                <w:b w:val="false"/>
+                <w:bCs w:val="false"/>
+                <w:sz w:val="20"/>
+                <w:szCs w:val="20"/>
+              </w:rPr>
+              <w:t xml:space="preserve">—</w:t>
+            </w:r>
+          </w:p>
+        </w:tc>
+        <w:tc>
+          <w:tcPr>
+            <w:tcW w:type="dxa" w:w="4030"/>
+            <w:shd w:fill="F2F6FB" w:val="clear"/>
+            <w:tcMar>
+              <w:top w:type="dxa" w:w="80"/>
+              <w:left w:type="dxa" w:w="100"/>
+              <w:bottom w:type="dxa" w:w="80"/>
+              <w:right w:type="dxa" w:w="100"/>
+            </w:tcMar>
+            <w:vAlign w:val="center"/>
+          </w:tcPr>
+          <w:p>
+            <w:pPr>
+              <w:jc w:val="left"/>
+            </w:pPr>
+            <w:r>
+              <w:rPr>
+                <w:rFonts w:ascii="Calibri" w:cs="Calibri" w:eastAsia="Calibri" w:hAnsi="Calibri"/>
+                <w:b w:val="false"/>
+                <w:bCs w:val="false"/>
+                <w:sz w:val="20"/>
+                <w:szCs w:val="20"/>
+              </w:rPr>
+              <w:t xml:space="preserve">Thời điểm hết khóa (UTC); set khi sai đủ 5 lần, khóa 15 phút (bổ sung)</w:t>
             </w:r>
           </w:p>
         </w:tc>
@@ -3505,7 +4831,7 @@
                 <w:sz w:val="20"/>
                 <w:szCs w:val="20"/>
               </w:rPr>
-              <w:t xml:space="preserve">NEWID()</w:t>
+              <w:t xml:space="preserve">Ứng dụng sinh (Guid.NewGuid())</w:t>
             </w:r>
           </w:p>
         </w:tc>
@@ -3590,7 +4916,7 @@
                 <w:sz w:val="20"/>
                 <w:szCs w:val="20"/>
               </w:rPr>
-              <w:t xml:space="preserve">varchar(20)</w:t>
+              <w:t xml:space="preserve">nvarchar(20)</w:t>
             </w:r>
           </w:p>
         </w:tc>
@@ -3812,7 +5138,7 @@
                 <w:sz w:val="20"/>
                 <w:szCs w:val="20"/>
               </w:rPr>
-              <w:t xml:space="preserve">Non-clustered index</w:t>
+              <w:t xml:space="preserve">—</w:t>
             </w:r>
           </w:p>
         </w:tc>
@@ -3866,7 +5192,7 @@
                 <w:sz w:val="20"/>
                 <w:szCs w:val="20"/>
               </w:rPr>
-              <w:t xml:space="preserve">Unicode cho tên tiếng Việt</w:t>
+              <w:t xml:space="preserve">Unicode cho tên tiếng Việt; không đặt index riêng (xem 2.5)</w:t>
             </w:r>
           </w:p>
         </w:tc>
@@ -3924,7 +5250,7 @@
                 <w:sz w:val="20"/>
                 <w:szCs w:val="20"/>
               </w:rPr>
-              <w:t xml:space="preserve">varchar(150)</w:t>
+              <w:t xml:space="preserve">nvarchar(150)</w:t>
             </w:r>
           </w:p>
         </w:tc>
@@ -4092,7 +5418,7 @@
                 <w:sz w:val="20"/>
                 <w:szCs w:val="20"/>
               </w:rPr>
-              <w:t xml:space="preserve">varchar(15)</w:t>
+              <w:t xml:space="preserve">nvarchar(15)</w:t>
             </w:r>
           </w:p>
         </w:tc>
@@ -4648,7 +5974,7 @@
                 <w:sz w:val="20"/>
                 <w:szCs w:val="20"/>
               </w:rPr>
-              <w:t xml:space="preserve">Filtered index WHERE IsDeleted=0</w:t>
+              <w:t xml:space="preserve">Filtered index WHERE [IsDeleted]=0</w:t>
             </w:r>
           </w:p>
         </w:tc>
@@ -4760,7 +6086,7 @@
                 <w:sz w:val="20"/>
                 <w:szCs w:val="20"/>
               </w:rPr>
-              <w:t xml:space="preserve">datetime2 / varchar(50)</w:t>
+              <w:t xml:space="preserve">datetime2 / nvarchar(50)</w:t>
             </w:r>
           </w:p>
         </w:tc>
@@ -4926,7 +6252,7 @@
                 <w:sz w:val="20"/>
                 <w:szCs w:val="20"/>
               </w:rPr>
-              <w:t xml:space="preserve">datetime2? / varchar(50)?</w:t>
+              <w:t xml:space="preserve">datetime2? / nvarchar(50)?</w:t>
             </w:r>
           </w:p>
         </w:tc>
@@ -5214,7 +6540,2318 @@
         <w:spacing w:after="140" w:before="280"/>
       </w:pPr>
       <w:r>
-        <w:t xml:space="preserve">2.3. Thiết kế Index</w:t>
+        <w:t xml:space="preserve">2.3. Bảng RefreshTokens (bổ sung khi triển khai)</w:t>
+      </w:r>
+    </w:p>
+    <w:tbl>
+      <w:tblPr>
+        <w:tblW w:type="dxa" w:w="10440"/>
+        <w:tblBorders>
+          <w:top w:val="single" w:color="auto" w:sz="4"/>
+          <w:left w:val="single" w:color="auto" w:sz="4"/>
+          <w:bottom w:val="single" w:color="auto" w:sz="4"/>
+          <w:right w:val="single" w:color="auto" w:sz="4"/>
+          <w:insideH w:val="single" w:color="auto" w:sz="4"/>
+          <w:insideV w:val="single" w:color="auto" w:sz="4"/>
+        </w:tblBorders>
+      </w:tblPr>
+      <w:tblGrid>
+        <w:gridCol w:w="1650"/>
+        <w:gridCol w:w="1650"/>
+        <w:gridCol w:w="1100"/>
+        <w:gridCol w:w="2010"/>
+        <w:gridCol w:w="4030"/>
+      </w:tblGrid>
+      <w:tr>
+        <w:trPr>
+          <w:tblHeader/>
+        </w:trPr>
+        <w:tc>
+          <w:tcPr>
+            <w:tcW w:type="dxa" w:w="1650"/>
+            <w:shd w:fill="1F3864" w:val="clear"/>
+            <w:tcMar>
+              <w:top w:type="dxa" w:w="80"/>
+              <w:left w:type="dxa" w:w="100"/>
+              <w:bottom w:type="dxa" w:w="80"/>
+              <w:right w:type="dxa" w:w="100"/>
+            </w:tcMar>
+            <w:vAlign w:val="center"/>
+          </w:tcPr>
+          <w:p>
+            <w:pPr>
+              <w:jc w:val="left"/>
+            </w:pPr>
+            <w:r>
+              <w:rPr>
+                <w:rFonts w:ascii="Calibri" w:cs="Calibri" w:eastAsia="Calibri" w:hAnsi="Calibri"/>
+                <w:b/>
+                <w:bCs/>
+                <w:color w:val="FFFFFF"/>
+                <w:sz w:val="20"/>
+                <w:szCs w:val="20"/>
+              </w:rPr>
+              <w:t xml:space="preserve">Trường</w:t>
+            </w:r>
+          </w:p>
+        </w:tc>
+        <w:tc>
+          <w:tcPr>
+            <w:tcW w:type="dxa" w:w="1650"/>
+            <w:shd w:fill="1F3864" w:val="clear"/>
+            <w:tcMar>
+              <w:top w:type="dxa" w:w="80"/>
+              <w:left w:type="dxa" w:w="100"/>
+              <w:bottom w:type="dxa" w:w="80"/>
+              <w:right w:type="dxa" w:w="100"/>
+            </w:tcMar>
+            <w:vAlign w:val="center"/>
+          </w:tcPr>
+          <w:p>
+            <w:pPr>
+              <w:jc w:val="left"/>
+            </w:pPr>
+            <w:r>
+              <w:rPr>
+                <w:rFonts w:ascii="Calibri" w:cs="Calibri" w:eastAsia="Calibri" w:hAnsi="Calibri"/>
+                <w:b/>
+                <w:bCs/>
+                <w:color w:val="FFFFFF"/>
+                <w:sz w:val="20"/>
+                <w:szCs w:val="20"/>
+              </w:rPr>
+              <w:t xml:space="preserve">Kiểu dữ liệu</w:t>
+            </w:r>
+          </w:p>
+        </w:tc>
+        <w:tc>
+          <w:tcPr>
+            <w:tcW w:type="dxa" w:w="1100"/>
+            <w:shd w:fill="1F3864" w:val="clear"/>
+            <w:tcMar>
+              <w:top w:type="dxa" w:w="80"/>
+              <w:left w:type="dxa" w:w="100"/>
+              <w:bottom w:type="dxa" w:w="80"/>
+              <w:right w:type="dxa" w:w="100"/>
+            </w:tcMar>
+            <w:vAlign w:val="center"/>
+          </w:tcPr>
+          <w:p>
+            <w:pPr>
+              <w:jc w:val="left"/>
+            </w:pPr>
+            <w:r>
+              <w:rPr>
+                <w:rFonts w:ascii="Calibri" w:cs="Calibri" w:eastAsia="Calibri" w:hAnsi="Calibri"/>
+                <w:b/>
+                <w:bCs/>
+                <w:color w:val="FFFFFF"/>
+                <w:sz w:val="20"/>
+                <w:szCs w:val="20"/>
+              </w:rPr>
+              <w:t xml:space="preserve">Nullable</w:t>
+            </w:r>
+          </w:p>
+        </w:tc>
+        <w:tc>
+          <w:tcPr>
+            <w:tcW w:type="dxa" w:w="2010"/>
+            <w:shd w:fill="1F3864" w:val="clear"/>
+            <w:tcMar>
+              <w:top w:type="dxa" w:w="80"/>
+              <w:left w:type="dxa" w:w="100"/>
+              <w:bottom w:type="dxa" w:w="80"/>
+              <w:right w:type="dxa" w:w="100"/>
+            </w:tcMar>
+            <w:vAlign w:val="center"/>
+          </w:tcPr>
+          <w:p>
+            <w:pPr>
+              <w:jc w:val="left"/>
+            </w:pPr>
+            <w:r>
+              <w:rPr>
+                <w:rFonts w:ascii="Calibri" w:cs="Calibri" w:eastAsia="Calibri" w:hAnsi="Calibri"/>
+                <w:b/>
+                <w:bCs/>
+                <w:color w:val="FFFFFF"/>
+                <w:sz w:val="20"/>
+                <w:szCs w:val="20"/>
+              </w:rPr>
+              <w:t xml:space="preserve">Index/Key</w:t>
+            </w:r>
+          </w:p>
+        </w:tc>
+        <w:tc>
+          <w:tcPr>
+            <w:tcW w:type="dxa" w:w="4030"/>
+            <w:shd w:fill="1F3864" w:val="clear"/>
+            <w:tcMar>
+              <w:top w:type="dxa" w:w="80"/>
+              <w:left w:type="dxa" w:w="100"/>
+              <w:bottom w:type="dxa" w:w="80"/>
+              <w:right w:type="dxa" w:w="100"/>
+            </w:tcMar>
+            <w:vAlign w:val="center"/>
+          </w:tcPr>
+          <w:p>
+            <w:pPr>
+              <w:jc w:val="left"/>
+            </w:pPr>
+            <w:r>
+              <w:rPr>
+                <w:rFonts w:ascii="Calibri" w:cs="Calibri" w:eastAsia="Calibri" w:hAnsi="Calibri"/>
+                <w:b/>
+                <w:bCs/>
+                <w:color w:val="FFFFFF"/>
+                <w:sz w:val="20"/>
+                <w:szCs w:val="20"/>
+              </w:rPr>
+              <w:t xml:space="preserve">Ghi chú</w:t>
+            </w:r>
+          </w:p>
+        </w:tc>
+      </w:tr>
+      <w:tr>
+        <w:tc>
+          <w:tcPr>
+            <w:tcW w:type="dxa" w:w="1650"/>
+            <w:tcMar>
+              <w:top w:type="dxa" w:w="80"/>
+              <w:left w:type="dxa" w:w="100"/>
+              <w:bottom w:type="dxa" w:w="80"/>
+              <w:right w:type="dxa" w:w="100"/>
+            </w:tcMar>
+            <w:vAlign w:val="center"/>
+          </w:tcPr>
+          <w:p>
+            <w:pPr>
+              <w:jc w:val="left"/>
+            </w:pPr>
+            <w:r>
+              <w:rPr>
+                <w:rFonts w:ascii="Calibri" w:cs="Calibri" w:eastAsia="Calibri" w:hAnsi="Calibri"/>
+                <w:b w:val="false"/>
+                <w:bCs w:val="false"/>
+                <w:sz w:val="20"/>
+                <w:szCs w:val="20"/>
+              </w:rPr>
+              <w:t xml:space="preserve">Id</w:t>
+            </w:r>
+          </w:p>
+        </w:tc>
+        <w:tc>
+          <w:tcPr>
+            <w:tcW w:type="dxa" w:w="1650"/>
+            <w:tcMar>
+              <w:top w:type="dxa" w:w="80"/>
+              <w:left w:type="dxa" w:w="100"/>
+              <w:bottom w:type="dxa" w:w="80"/>
+              <w:right w:type="dxa" w:w="100"/>
+            </w:tcMar>
+            <w:vAlign w:val="center"/>
+          </w:tcPr>
+          <w:p>
+            <w:pPr>
+              <w:jc w:val="left"/>
+            </w:pPr>
+            <w:r>
+              <w:rPr>
+                <w:rFonts w:ascii="Calibri" w:cs="Calibri" w:eastAsia="Calibri" w:hAnsi="Calibri"/>
+                <w:b w:val="false"/>
+                <w:bCs w:val="false"/>
+                <w:sz w:val="20"/>
+                <w:szCs w:val="20"/>
+              </w:rPr>
+              <w:t xml:space="preserve">uniqueidentifier</w:t>
+            </w:r>
+          </w:p>
+        </w:tc>
+        <w:tc>
+          <w:tcPr>
+            <w:tcW w:type="dxa" w:w="1100"/>
+            <w:tcMar>
+              <w:top w:type="dxa" w:w="80"/>
+              <w:left w:type="dxa" w:w="100"/>
+              <w:bottom w:type="dxa" w:w="80"/>
+              <w:right w:type="dxa" w:w="100"/>
+            </w:tcMar>
+            <w:vAlign w:val="center"/>
+          </w:tcPr>
+          <w:p>
+            <w:pPr>
+              <w:jc w:val="left"/>
+            </w:pPr>
+            <w:r>
+              <w:rPr>
+                <w:rFonts w:ascii="Calibri" w:cs="Calibri" w:eastAsia="Calibri" w:hAnsi="Calibri"/>
+                <w:b w:val="false"/>
+                <w:bCs w:val="false"/>
+                <w:sz w:val="20"/>
+                <w:szCs w:val="20"/>
+              </w:rPr>
+              <w:t xml:space="preserve">Không</w:t>
+            </w:r>
+          </w:p>
+        </w:tc>
+        <w:tc>
+          <w:tcPr>
+            <w:tcW w:type="dxa" w:w="2010"/>
+            <w:tcMar>
+              <w:top w:type="dxa" w:w="80"/>
+              <w:left w:type="dxa" w:w="100"/>
+              <w:bottom w:type="dxa" w:w="80"/>
+              <w:right w:type="dxa" w:w="100"/>
+            </w:tcMar>
+            <w:vAlign w:val="center"/>
+          </w:tcPr>
+          <w:p>
+            <w:pPr>
+              <w:jc w:val="left"/>
+            </w:pPr>
+            <w:r>
+              <w:rPr>
+                <w:rFonts w:ascii="Calibri" w:cs="Calibri" w:eastAsia="Calibri" w:hAnsi="Calibri"/>
+                <w:b w:val="false"/>
+                <w:bCs w:val="false"/>
+                <w:sz w:val="20"/>
+                <w:szCs w:val="20"/>
+              </w:rPr>
+              <w:t xml:space="preserve">PK</w:t>
+            </w:r>
+          </w:p>
+        </w:tc>
+        <w:tc>
+          <w:tcPr>
+            <w:tcW w:type="dxa" w:w="4030"/>
+            <w:tcMar>
+              <w:top w:type="dxa" w:w="80"/>
+              <w:left w:type="dxa" w:w="100"/>
+              <w:bottom w:type="dxa" w:w="80"/>
+              <w:right w:type="dxa" w:w="100"/>
+            </w:tcMar>
+            <w:vAlign w:val="center"/>
+          </w:tcPr>
+          <w:p>
+            <w:pPr>
+              <w:jc w:val="left"/>
+            </w:pPr>
+            <w:r>
+              <w:rPr>
+                <w:rFonts w:ascii="Calibri" w:cs="Calibri" w:eastAsia="Calibri" w:hAnsi="Calibri"/>
+                <w:b w:val="false"/>
+                <w:bCs w:val="false"/>
+                <w:sz w:val="20"/>
+                <w:szCs w:val="20"/>
+              </w:rPr>
+              <w:t xml:space="preserve">Ứng dụng sinh GUID</w:t>
+            </w:r>
+          </w:p>
+        </w:tc>
+      </w:tr>
+      <w:tr>
+        <w:tc>
+          <w:tcPr>
+            <w:tcW w:type="dxa" w:w="1650"/>
+            <w:shd w:fill="F2F6FB" w:val="clear"/>
+            <w:tcMar>
+              <w:top w:type="dxa" w:w="80"/>
+              <w:left w:type="dxa" w:w="100"/>
+              <w:bottom w:type="dxa" w:w="80"/>
+              <w:right w:type="dxa" w:w="100"/>
+            </w:tcMar>
+            <w:vAlign w:val="center"/>
+          </w:tcPr>
+          <w:p>
+            <w:pPr>
+              <w:jc w:val="left"/>
+            </w:pPr>
+            <w:r>
+              <w:rPr>
+                <w:rFonts w:ascii="Calibri" w:cs="Calibri" w:eastAsia="Calibri" w:hAnsi="Calibri"/>
+                <w:b w:val="false"/>
+                <w:bCs w:val="false"/>
+                <w:sz w:val="20"/>
+                <w:szCs w:val="20"/>
+              </w:rPr>
+              <w:t xml:space="preserve">UserId</w:t>
+            </w:r>
+          </w:p>
+        </w:tc>
+        <w:tc>
+          <w:tcPr>
+            <w:tcW w:type="dxa" w:w="1650"/>
+            <w:shd w:fill="F2F6FB" w:val="clear"/>
+            <w:tcMar>
+              <w:top w:type="dxa" w:w="80"/>
+              <w:left w:type="dxa" w:w="100"/>
+              <w:bottom w:type="dxa" w:w="80"/>
+              <w:right w:type="dxa" w:w="100"/>
+            </w:tcMar>
+            <w:vAlign w:val="center"/>
+          </w:tcPr>
+          <w:p>
+            <w:pPr>
+              <w:jc w:val="left"/>
+            </w:pPr>
+            <w:r>
+              <w:rPr>
+                <w:rFonts w:ascii="Calibri" w:cs="Calibri" w:eastAsia="Calibri" w:hAnsi="Calibri"/>
+                <w:b w:val="false"/>
+                <w:bCs w:val="false"/>
+                <w:sz w:val="20"/>
+                <w:szCs w:val="20"/>
+              </w:rPr>
+              <w:t xml:space="preserve">uniqueidentifier</w:t>
+            </w:r>
+          </w:p>
+        </w:tc>
+        <w:tc>
+          <w:tcPr>
+            <w:tcW w:type="dxa" w:w="1100"/>
+            <w:shd w:fill="F2F6FB" w:val="clear"/>
+            <w:tcMar>
+              <w:top w:type="dxa" w:w="80"/>
+              <w:left w:type="dxa" w:w="100"/>
+              <w:bottom w:type="dxa" w:w="80"/>
+              <w:right w:type="dxa" w:w="100"/>
+            </w:tcMar>
+            <w:vAlign w:val="center"/>
+          </w:tcPr>
+          <w:p>
+            <w:pPr>
+              <w:jc w:val="left"/>
+            </w:pPr>
+            <w:r>
+              <w:rPr>
+                <w:rFonts w:ascii="Calibri" w:cs="Calibri" w:eastAsia="Calibri" w:hAnsi="Calibri"/>
+                <w:b w:val="false"/>
+                <w:bCs w:val="false"/>
+                <w:sz w:val="20"/>
+                <w:szCs w:val="20"/>
+              </w:rPr>
+              <w:t xml:space="preserve">Không</w:t>
+            </w:r>
+          </w:p>
+        </w:tc>
+        <w:tc>
+          <w:tcPr>
+            <w:tcW w:type="dxa" w:w="2010"/>
+            <w:shd w:fill="F2F6FB" w:val="clear"/>
+            <w:tcMar>
+              <w:top w:type="dxa" w:w="80"/>
+              <w:left w:type="dxa" w:w="100"/>
+              <w:bottom w:type="dxa" w:w="80"/>
+              <w:right w:type="dxa" w:w="100"/>
+            </w:tcMar>
+            <w:vAlign w:val="center"/>
+          </w:tcPr>
+          <w:p>
+            <w:pPr>
+              <w:jc w:val="left"/>
+            </w:pPr>
+            <w:r>
+              <w:rPr>
+                <w:rFonts w:ascii="Calibri" w:cs="Calibri" w:eastAsia="Calibri" w:hAnsi="Calibri"/>
+                <w:b w:val="false"/>
+                <w:bCs w:val="false"/>
+                <w:sz w:val="20"/>
+                <w:szCs w:val="20"/>
+              </w:rPr>
+              <w:t xml:space="preserve">FK → Users.Id, index</w:t>
+            </w:r>
+          </w:p>
+        </w:tc>
+        <w:tc>
+          <w:tcPr>
+            <w:tcW w:type="dxa" w:w="4030"/>
+            <w:shd w:fill="F2F6FB" w:val="clear"/>
+            <w:tcMar>
+              <w:top w:type="dxa" w:w="80"/>
+              <w:left w:type="dxa" w:w="100"/>
+              <w:bottom w:type="dxa" w:w="80"/>
+              <w:right w:type="dxa" w:w="100"/>
+            </w:tcMar>
+            <w:vAlign w:val="center"/>
+          </w:tcPr>
+          <w:p>
+            <w:pPr>
+              <w:jc w:val="left"/>
+            </w:pPr>
+            <w:r>
+              <w:rPr>
+                <w:rFonts w:ascii="Calibri" w:cs="Calibri" w:eastAsia="Calibri" w:hAnsi="Calibri"/>
+                <w:b w:val="false"/>
+                <w:bCs w:val="false"/>
+                <w:sz w:val="20"/>
+                <w:szCs w:val="20"/>
+              </w:rPr>
+              <w:t xml:space="preserve">ON DELETE CASCADE; 1 user có nhiều refresh token</w:t>
+            </w:r>
+          </w:p>
+        </w:tc>
+      </w:tr>
+      <w:tr>
+        <w:tc>
+          <w:tcPr>
+            <w:tcW w:type="dxa" w:w="1650"/>
+            <w:tcMar>
+              <w:top w:type="dxa" w:w="80"/>
+              <w:left w:type="dxa" w:w="100"/>
+              <w:bottom w:type="dxa" w:w="80"/>
+              <w:right w:type="dxa" w:w="100"/>
+            </w:tcMar>
+            <w:vAlign w:val="center"/>
+          </w:tcPr>
+          <w:p>
+            <w:pPr>
+              <w:jc w:val="left"/>
+            </w:pPr>
+            <w:r>
+              <w:rPr>
+                <w:rFonts w:ascii="Calibri" w:cs="Calibri" w:eastAsia="Calibri" w:hAnsi="Calibri"/>
+                <w:b w:val="false"/>
+                <w:bCs w:val="false"/>
+                <w:sz w:val="20"/>
+                <w:szCs w:val="20"/>
+              </w:rPr>
+              <w:t xml:space="preserve">TokenHash</w:t>
+            </w:r>
+          </w:p>
+        </w:tc>
+        <w:tc>
+          <w:tcPr>
+            <w:tcW w:type="dxa" w:w="1650"/>
+            <w:tcMar>
+              <w:top w:type="dxa" w:w="80"/>
+              <w:left w:type="dxa" w:w="100"/>
+              <w:bottom w:type="dxa" w:w="80"/>
+              <w:right w:type="dxa" w:w="100"/>
+            </w:tcMar>
+            <w:vAlign w:val="center"/>
+          </w:tcPr>
+          <w:p>
+            <w:pPr>
+              <w:jc w:val="left"/>
+            </w:pPr>
+            <w:r>
+              <w:rPr>
+                <w:rFonts w:ascii="Calibri" w:cs="Calibri" w:eastAsia="Calibri" w:hAnsi="Calibri"/>
+                <w:b w:val="false"/>
+                <w:bCs w:val="false"/>
+                <w:sz w:val="20"/>
+                <w:szCs w:val="20"/>
+              </w:rPr>
+              <w:t xml:space="preserve">nvarchar(88)</w:t>
+            </w:r>
+          </w:p>
+        </w:tc>
+        <w:tc>
+          <w:tcPr>
+            <w:tcW w:type="dxa" w:w="1100"/>
+            <w:tcMar>
+              <w:top w:type="dxa" w:w="80"/>
+              <w:left w:type="dxa" w:w="100"/>
+              <w:bottom w:type="dxa" w:w="80"/>
+              <w:right w:type="dxa" w:w="100"/>
+            </w:tcMar>
+            <w:vAlign w:val="center"/>
+          </w:tcPr>
+          <w:p>
+            <w:pPr>
+              <w:jc w:val="left"/>
+            </w:pPr>
+            <w:r>
+              <w:rPr>
+                <w:rFonts w:ascii="Calibri" w:cs="Calibri" w:eastAsia="Calibri" w:hAnsi="Calibri"/>
+                <w:b w:val="false"/>
+                <w:bCs w:val="false"/>
+                <w:sz w:val="20"/>
+                <w:szCs w:val="20"/>
+              </w:rPr>
+              <w:t xml:space="preserve">Không</w:t>
+            </w:r>
+          </w:p>
+        </w:tc>
+        <w:tc>
+          <w:tcPr>
+            <w:tcW w:type="dxa" w:w="2010"/>
+            <w:tcMar>
+              <w:top w:type="dxa" w:w="80"/>
+              <w:left w:type="dxa" w:w="100"/>
+              <w:bottom w:type="dxa" w:w="80"/>
+              <w:right w:type="dxa" w:w="100"/>
+            </w:tcMar>
+            <w:vAlign w:val="center"/>
+          </w:tcPr>
+          <w:p>
+            <w:pPr>
+              <w:jc w:val="left"/>
+            </w:pPr>
+            <w:r>
+              <w:rPr>
+                <w:rFonts w:ascii="Calibri" w:cs="Calibri" w:eastAsia="Calibri" w:hAnsi="Calibri"/>
+                <w:b w:val="false"/>
+                <w:bCs w:val="false"/>
+                <w:sz w:val="20"/>
+                <w:szCs w:val="20"/>
+              </w:rPr>
+              <w:t xml:space="preserve">Unique index</w:t>
+            </w:r>
+          </w:p>
+        </w:tc>
+        <w:tc>
+          <w:tcPr>
+            <w:tcW w:type="dxa" w:w="4030"/>
+            <w:tcMar>
+              <w:top w:type="dxa" w:w="80"/>
+              <w:left w:type="dxa" w:w="100"/>
+              <w:bottom w:type="dxa" w:w="80"/>
+              <w:right w:type="dxa" w:w="100"/>
+            </w:tcMar>
+            <w:vAlign w:val="center"/>
+          </w:tcPr>
+          <w:p>
+            <w:pPr>
+              <w:jc w:val="left"/>
+            </w:pPr>
+            <w:r>
+              <w:rPr>
+                <w:rFonts w:ascii="Calibri" w:cs="Calibri" w:eastAsia="Calibri" w:hAnsi="Calibri"/>
+                <w:b w:val="false"/>
+                <w:bCs w:val="false"/>
+                <w:sz w:val="20"/>
+                <w:szCs w:val="20"/>
+              </w:rPr>
+              <w:t xml:space="preserve">SHA-256 (Base64) của token — không bao giờ lưu giá trị gốc</w:t>
+            </w:r>
+          </w:p>
+        </w:tc>
+      </w:tr>
+      <w:tr>
+        <w:tc>
+          <w:tcPr>
+            <w:tcW w:type="dxa" w:w="1650"/>
+            <w:shd w:fill="F2F6FB" w:val="clear"/>
+            <w:tcMar>
+              <w:top w:type="dxa" w:w="80"/>
+              <w:left w:type="dxa" w:w="100"/>
+              <w:bottom w:type="dxa" w:w="80"/>
+              <w:right w:type="dxa" w:w="100"/>
+            </w:tcMar>
+            <w:vAlign w:val="center"/>
+          </w:tcPr>
+          <w:p>
+            <w:pPr>
+              <w:jc w:val="left"/>
+            </w:pPr>
+            <w:r>
+              <w:rPr>
+                <w:rFonts w:ascii="Calibri" w:cs="Calibri" w:eastAsia="Calibri" w:hAnsi="Calibri"/>
+                <w:b w:val="false"/>
+                <w:bCs w:val="false"/>
+                <w:sz w:val="20"/>
+                <w:szCs w:val="20"/>
+              </w:rPr>
+              <w:t xml:space="preserve">ExpiresAtUtc</w:t>
+            </w:r>
+          </w:p>
+        </w:tc>
+        <w:tc>
+          <w:tcPr>
+            <w:tcW w:type="dxa" w:w="1650"/>
+            <w:shd w:fill="F2F6FB" w:val="clear"/>
+            <w:tcMar>
+              <w:top w:type="dxa" w:w="80"/>
+              <w:left w:type="dxa" w:w="100"/>
+              <w:bottom w:type="dxa" w:w="80"/>
+              <w:right w:type="dxa" w:w="100"/>
+            </w:tcMar>
+            <w:vAlign w:val="center"/>
+          </w:tcPr>
+          <w:p>
+            <w:pPr>
+              <w:jc w:val="left"/>
+            </w:pPr>
+            <w:r>
+              <w:rPr>
+                <w:rFonts w:ascii="Calibri" w:cs="Calibri" w:eastAsia="Calibri" w:hAnsi="Calibri"/>
+                <w:b w:val="false"/>
+                <w:bCs w:val="false"/>
+                <w:sz w:val="20"/>
+                <w:szCs w:val="20"/>
+              </w:rPr>
+              <w:t xml:space="preserve">datetime2</w:t>
+            </w:r>
+          </w:p>
+        </w:tc>
+        <w:tc>
+          <w:tcPr>
+            <w:tcW w:type="dxa" w:w="1100"/>
+            <w:shd w:fill="F2F6FB" w:val="clear"/>
+            <w:tcMar>
+              <w:top w:type="dxa" w:w="80"/>
+              <w:left w:type="dxa" w:w="100"/>
+              <w:bottom w:type="dxa" w:w="80"/>
+              <w:right w:type="dxa" w:w="100"/>
+            </w:tcMar>
+            <w:vAlign w:val="center"/>
+          </w:tcPr>
+          <w:p>
+            <w:pPr>
+              <w:jc w:val="left"/>
+            </w:pPr>
+            <w:r>
+              <w:rPr>
+                <w:rFonts w:ascii="Calibri" w:cs="Calibri" w:eastAsia="Calibri" w:hAnsi="Calibri"/>
+                <w:b w:val="false"/>
+                <w:bCs w:val="false"/>
+                <w:sz w:val="20"/>
+                <w:szCs w:val="20"/>
+              </w:rPr>
+              <w:t xml:space="preserve">Không</w:t>
+            </w:r>
+          </w:p>
+        </w:tc>
+        <w:tc>
+          <w:tcPr>
+            <w:tcW w:type="dxa" w:w="2010"/>
+            <w:shd w:fill="F2F6FB" w:val="clear"/>
+            <w:tcMar>
+              <w:top w:type="dxa" w:w="80"/>
+              <w:left w:type="dxa" w:w="100"/>
+              <w:bottom w:type="dxa" w:w="80"/>
+              <w:right w:type="dxa" w:w="100"/>
+            </w:tcMar>
+            <w:vAlign w:val="center"/>
+          </w:tcPr>
+          <w:p>
+            <w:pPr>
+              <w:jc w:val="left"/>
+            </w:pPr>
+            <w:r>
+              <w:rPr>
+                <w:rFonts w:ascii="Calibri" w:cs="Calibri" w:eastAsia="Calibri" w:hAnsi="Calibri"/>
+                <w:b w:val="false"/>
+                <w:bCs w:val="false"/>
+                <w:sz w:val="20"/>
+                <w:szCs w:val="20"/>
+              </w:rPr>
+              <w:t xml:space="preserve">—</w:t>
+            </w:r>
+          </w:p>
+        </w:tc>
+        <w:tc>
+          <w:tcPr>
+            <w:tcW w:type="dxa" w:w="4030"/>
+            <w:shd w:fill="F2F6FB" w:val="clear"/>
+            <w:tcMar>
+              <w:top w:type="dxa" w:w="80"/>
+              <w:left w:type="dxa" w:w="100"/>
+              <w:bottom w:type="dxa" w:w="80"/>
+              <w:right w:type="dxa" w:w="100"/>
+            </w:tcMar>
+            <w:vAlign w:val="center"/>
+          </w:tcPr>
+          <w:p>
+            <w:pPr>
+              <w:jc w:val="left"/>
+            </w:pPr>
+            <w:r>
+              <w:rPr>
+                <w:rFonts w:ascii="Calibri" w:cs="Calibri" w:eastAsia="Calibri" w:hAnsi="Calibri"/>
+                <w:b w:val="false"/>
+                <w:bCs w:val="false"/>
+                <w:sz w:val="20"/>
+                <w:szCs w:val="20"/>
+              </w:rPr>
+              <w:t xml:space="preserve">Hết hạn sau 7 ngày (Jwt:RefreshTokenExpiryDays)</w:t>
+            </w:r>
+          </w:p>
+        </w:tc>
+      </w:tr>
+      <w:tr>
+        <w:tc>
+          <w:tcPr>
+            <w:tcW w:type="dxa" w:w="1650"/>
+            <w:tcMar>
+              <w:top w:type="dxa" w:w="80"/>
+              <w:left w:type="dxa" w:w="100"/>
+              <w:bottom w:type="dxa" w:w="80"/>
+              <w:right w:type="dxa" w:w="100"/>
+            </w:tcMar>
+            <w:vAlign w:val="center"/>
+          </w:tcPr>
+          <w:p>
+            <w:pPr>
+              <w:jc w:val="left"/>
+            </w:pPr>
+            <w:r>
+              <w:rPr>
+                <w:rFonts w:ascii="Calibri" w:cs="Calibri" w:eastAsia="Calibri" w:hAnsi="Calibri"/>
+                <w:b w:val="false"/>
+                <w:bCs w:val="false"/>
+                <w:sz w:val="20"/>
+                <w:szCs w:val="20"/>
+              </w:rPr>
+              <w:t xml:space="preserve">CreatedAtUtc</w:t>
+            </w:r>
+          </w:p>
+        </w:tc>
+        <w:tc>
+          <w:tcPr>
+            <w:tcW w:type="dxa" w:w="1650"/>
+            <w:tcMar>
+              <w:top w:type="dxa" w:w="80"/>
+              <w:left w:type="dxa" w:w="100"/>
+              <w:bottom w:type="dxa" w:w="80"/>
+              <w:right w:type="dxa" w:w="100"/>
+            </w:tcMar>
+            <w:vAlign w:val="center"/>
+          </w:tcPr>
+          <w:p>
+            <w:pPr>
+              <w:jc w:val="left"/>
+            </w:pPr>
+            <w:r>
+              <w:rPr>
+                <w:rFonts w:ascii="Calibri" w:cs="Calibri" w:eastAsia="Calibri" w:hAnsi="Calibri"/>
+                <w:b w:val="false"/>
+                <w:bCs w:val="false"/>
+                <w:sz w:val="20"/>
+                <w:szCs w:val="20"/>
+              </w:rPr>
+              <w:t xml:space="preserve">datetime2</w:t>
+            </w:r>
+          </w:p>
+        </w:tc>
+        <w:tc>
+          <w:tcPr>
+            <w:tcW w:type="dxa" w:w="1100"/>
+            <w:tcMar>
+              <w:top w:type="dxa" w:w="80"/>
+              <w:left w:type="dxa" w:w="100"/>
+              <w:bottom w:type="dxa" w:w="80"/>
+              <w:right w:type="dxa" w:w="100"/>
+            </w:tcMar>
+            <w:vAlign w:val="center"/>
+          </w:tcPr>
+          <w:p>
+            <w:pPr>
+              <w:jc w:val="left"/>
+            </w:pPr>
+            <w:r>
+              <w:rPr>
+                <w:rFonts w:ascii="Calibri" w:cs="Calibri" w:eastAsia="Calibri" w:hAnsi="Calibri"/>
+                <w:b w:val="false"/>
+                <w:bCs w:val="false"/>
+                <w:sz w:val="20"/>
+                <w:szCs w:val="20"/>
+              </w:rPr>
+              <w:t xml:space="preserve">Không</w:t>
+            </w:r>
+          </w:p>
+        </w:tc>
+        <w:tc>
+          <w:tcPr>
+            <w:tcW w:type="dxa" w:w="2010"/>
+            <w:tcMar>
+              <w:top w:type="dxa" w:w="80"/>
+              <w:left w:type="dxa" w:w="100"/>
+              <w:bottom w:type="dxa" w:w="80"/>
+              <w:right w:type="dxa" w:w="100"/>
+            </w:tcMar>
+            <w:vAlign w:val="center"/>
+          </w:tcPr>
+          <w:p>
+            <w:pPr>
+              <w:jc w:val="left"/>
+            </w:pPr>
+            <w:r>
+              <w:rPr>
+                <w:rFonts w:ascii="Calibri" w:cs="Calibri" w:eastAsia="Calibri" w:hAnsi="Calibri"/>
+                <w:b w:val="false"/>
+                <w:bCs w:val="false"/>
+                <w:sz w:val="20"/>
+                <w:szCs w:val="20"/>
+              </w:rPr>
+              <w:t xml:space="preserve">—</w:t>
+            </w:r>
+          </w:p>
+        </w:tc>
+        <w:tc>
+          <w:tcPr>
+            <w:tcW w:type="dxa" w:w="4030"/>
+            <w:tcMar>
+              <w:top w:type="dxa" w:w="80"/>
+              <w:left w:type="dxa" w:w="100"/>
+              <w:bottom w:type="dxa" w:w="80"/>
+              <w:right w:type="dxa" w:w="100"/>
+            </w:tcMar>
+            <w:vAlign w:val="center"/>
+          </w:tcPr>
+          <w:p>
+            <w:pPr>
+              <w:jc w:val="left"/>
+            </w:pPr>
+            <w:r>
+              <w:rPr>
+                <w:rFonts w:ascii="Calibri" w:cs="Calibri" w:eastAsia="Calibri" w:hAnsi="Calibri"/>
+                <w:b w:val="false"/>
+                <w:bCs w:val="false"/>
+                <w:sz w:val="20"/>
+                <w:szCs w:val="20"/>
+              </w:rPr>
+              <w:t xml:space="preserve">UTC</w:t>
+            </w:r>
+          </w:p>
+        </w:tc>
+      </w:tr>
+      <w:tr>
+        <w:tc>
+          <w:tcPr>
+            <w:tcW w:type="dxa" w:w="1650"/>
+            <w:shd w:fill="F2F6FB" w:val="clear"/>
+            <w:tcMar>
+              <w:top w:type="dxa" w:w="80"/>
+              <w:left w:type="dxa" w:w="100"/>
+              <w:bottom w:type="dxa" w:w="80"/>
+              <w:right w:type="dxa" w:w="100"/>
+            </w:tcMar>
+            <w:vAlign w:val="center"/>
+          </w:tcPr>
+          <w:p>
+            <w:pPr>
+              <w:jc w:val="left"/>
+            </w:pPr>
+            <w:r>
+              <w:rPr>
+                <w:rFonts w:ascii="Calibri" w:cs="Calibri" w:eastAsia="Calibri" w:hAnsi="Calibri"/>
+                <w:b w:val="false"/>
+                <w:bCs w:val="false"/>
+                <w:sz w:val="20"/>
+                <w:szCs w:val="20"/>
+              </w:rPr>
+              <w:t xml:space="preserve">RevokedAtUtc</w:t>
+            </w:r>
+          </w:p>
+        </w:tc>
+        <w:tc>
+          <w:tcPr>
+            <w:tcW w:type="dxa" w:w="1650"/>
+            <w:shd w:fill="F2F6FB" w:val="clear"/>
+            <w:tcMar>
+              <w:top w:type="dxa" w:w="80"/>
+              <w:left w:type="dxa" w:w="100"/>
+              <w:bottom w:type="dxa" w:w="80"/>
+              <w:right w:type="dxa" w:w="100"/>
+            </w:tcMar>
+            <w:vAlign w:val="center"/>
+          </w:tcPr>
+          <w:p>
+            <w:pPr>
+              <w:jc w:val="left"/>
+            </w:pPr>
+            <w:r>
+              <w:rPr>
+                <w:rFonts w:ascii="Calibri" w:cs="Calibri" w:eastAsia="Calibri" w:hAnsi="Calibri"/>
+                <w:b w:val="false"/>
+                <w:bCs w:val="false"/>
+                <w:sz w:val="20"/>
+                <w:szCs w:val="20"/>
+              </w:rPr>
+              <w:t xml:space="preserve">datetime2</w:t>
+            </w:r>
+          </w:p>
+        </w:tc>
+        <w:tc>
+          <w:tcPr>
+            <w:tcW w:type="dxa" w:w="1100"/>
+            <w:shd w:fill="F2F6FB" w:val="clear"/>
+            <w:tcMar>
+              <w:top w:type="dxa" w:w="80"/>
+              <w:left w:type="dxa" w:w="100"/>
+              <w:bottom w:type="dxa" w:w="80"/>
+              <w:right w:type="dxa" w:w="100"/>
+            </w:tcMar>
+            <w:vAlign w:val="center"/>
+          </w:tcPr>
+          <w:p>
+            <w:pPr>
+              <w:jc w:val="left"/>
+            </w:pPr>
+            <w:r>
+              <w:rPr>
+                <w:rFonts w:ascii="Calibri" w:cs="Calibri" w:eastAsia="Calibri" w:hAnsi="Calibri"/>
+                <w:b w:val="false"/>
+                <w:bCs w:val="false"/>
+                <w:sz w:val="20"/>
+                <w:szCs w:val="20"/>
+              </w:rPr>
+              <w:t xml:space="preserve">Có</w:t>
+            </w:r>
+          </w:p>
+        </w:tc>
+        <w:tc>
+          <w:tcPr>
+            <w:tcW w:type="dxa" w:w="2010"/>
+            <w:shd w:fill="F2F6FB" w:val="clear"/>
+            <w:tcMar>
+              <w:top w:type="dxa" w:w="80"/>
+              <w:left w:type="dxa" w:w="100"/>
+              <w:bottom w:type="dxa" w:w="80"/>
+              <w:right w:type="dxa" w:w="100"/>
+            </w:tcMar>
+            <w:vAlign w:val="center"/>
+          </w:tcPr>
+          <w:p>
+            <w:pPr>
+              <w:jc w:val="left"/>
+            </w:pPr>
+            <w:r>
+              <w:rPr>
+                <w:rFonts w:ascii="Calibri" w:cs="Calibri" w:eastAsia="Calibri" w:hAnsi="Calibri"/>
+                <w:b w:val="false"/>
+                <w:bCs w:val="false"/>
+                <w:sz w:val="20"/>
+                <w:szCs w:val="20"/>
+              </w:rPr>
+              <w:t xml:space="preserve">—</w:t>
+            </w:r>
+          </w:p>
+        </w:tc>
+        <w:tc>
+          <w:tcPr>
+            <w:tcW w:type="dxa" w:w="4030"/>
+            <w:shd w:fill="F2F6FB" w:val="clear"/>
+            <w:tcMar>
+              <w:top w:type="dxa" w:w="80"/>
+              <w:left w:type="dxa" w:w="100"/>
+              <w:bottom w:type="dxa" w:w="80"/>
+              <w:right w:type="dxa" w:w="100"/>
+            </w:tcMar>
+            <w:vAlign w:val="center"/>
+          </w:tcPr>
+          <w:p>
+            <w:pPr>
+              <w:jc w:val="left"/>
+            </w:pPr>
+            <w:r>
+              <w:rPr>
+                <w:rFonts w:ascii="Calibri" w:cs="Calibri" w:eastAsia="Calibri" w:hAnsi="Calibri"/>
+                <w:b w:val="false"/>
+                <w:bCs w:val="false"/>
+                <w:sz w:val="20"/>
+                <w:szCs w:val="20"/>
+              </w:rPr>
+              <w:t xml:space="preserve">Set khi đăng xuất hoặc khi token bị xoay vòng; token đã thu hồi dùng lại → 401</w:t>
+            </w:r>
+          </w:p>
+        </w:tc>
+      </w:tr>
+    </w:tbl>
+    <w:p>
+      <w:pPr>
+        <w:pStyle w:val="Heading2"/>
+        <w:spacing w:after="140" w:before="280"/>
+      </w:pPr>
+      <w:r>
+        <w:t xml:space="preserve">2.4. Bảng AuditLogs (bổ sung khi triển khai)</w:t>
+      </w:r>
+    </w:p>
+    <w:tbl>
+      <w:tblPr>
+        <w:tblW w:type="dxa" w:w="10440"/>
+        <w:tblBorders>
+          <w:top w:val="single" w:color="auto" w:sz="4"/>
+          <w:left w:val="single" w:color="auto" w:sz="4"/>
+          <w:bottom w:val="single" w:color="auto" w:sz="4"/>
+          <w:right w:val="single" w:color="auto" w:sz="4"/>
+          <w:insideH w:val="single" w:color="auto" w:sz="4"/>
+          <w:insideV w:val="single" w:color="auto" w:sz="4"/>
+        </w:tblBorders>
+      </w:tblPr>
+      <w:tblGrid>
+        <w:gridCol w:w="1650"/>
+        <w:gridCol w:w="1650"/>
+        <w:gridCol w:w="1100"/>
+        <w:gridCol w:w="2010"/>
+        <w:gridCol w:w="4030"/>
+      </w:tblGrid>
+      <w:tr>
+        <w:trPr>
+          <w:tblHeader/>
+        </w:trPr>
+        <w:tc>
+          <w:tcPr>
+            <w:tcW w:type="dxa" w:w="1650"/>
+            <w:shd w:fill="1F3864" w:val="clear"/>
+            <w:tcMar>
+              <w:top w:type="dxa" w:w="80"/>
+              <w:left w:type="dxa" w:w="100"/>
+              <w:bottom w:type="dxa" w:w="80"/>
+              <w:right w:type="dxa" w:w="100"/>
+            </w:tcMar>
+            <w:vAlign w:val="center"/>
+          </w:tcPr>
+          <w:p>
+            <w:pPr>
+              <w:jc w:val="left"/>
+            </w:pPr>
+            <w:r>
+              <w:rPr>
+                <w:rFonts w:ascii="Calibri" w:cs="Calibri" w:eastAsia="Calibri" w:hAnsi="Calibri"/>
+                <w:b/>
+                <w:bCs/>
+                <w:color w:val="FFFFFF"/>
+                <w:sz w:val="20"/>
+                <w:szCs w:val="20"/>
+              </w:rPr>
+              <w:t xml:space="preserve">Trường</w:t>
+            </w:r>
+          </w:p>
+        </w:tc>
+        <w:tc>
+          <w:tcPr>
+            <w:tcW w:type="dxa" w:w="1650"/>
+            <w:shd w:fill="1F3864" w:val="clear"/>
+            <w:tcMar>
+              <w:top w:type="dxa" w:w="80"/>
+              <w:left w:type="dxa" w:w="100"/>
+              <w:bottom w:type="dxa" w:w="80"/>
+              <w:right w:type="dxa" w:w="100"/>
+            </w:tcMar>
+            <w:vAlign w:val="center"/>
+          </w:tcPr>
+          <w:p>
+            <w:pPr>
+              <w:jc w:val="left"/>
+            </w:pPr>
+            <w:r>
+              <w:rPr>
+                <w:rFonts w:ascii="Calibri" w:cs="Calibri" w:eastAsia="Calibri" w:hAnsi="Calibri"/>
+                <w:b/>
+                <w:bCs/>
+                <w:color w:val="FFFFFF"/>
+                <w:sz w:val="20"/>
+                <w:szCs w:val="20"/>
+              </w:rPr>
+              <w:t xml:space="preserve">Kiểu dữ liệu</w:t>
+            </w:r>
+          </w:p>
+        </w:tc>
+        <w:tc>
+          <w:tcPr>
+            <w:tcW w:type="dxa" w:w="1100"/>
+            <w:shd w:fill="1F3864" w:val="clear"/>
+            <w:tcMar>
+              <w:top w:type="dxa" w:w="80"/>
+              <w:left w:type="dxa" w:w="100"/>
+              <w:bottom w:type="dxa" w:w="80"/>
+              <w:right w:type="dxa" w:w="100"/>
+            </w:tcMar>
+            <w:vAlign w:val="center"/>
+          </w:tcPr>
+          <w:p>
+            <w:pPr>
+              <w:jc w:val="left"/>
+            </w:pPr>
+            <w:r>
+              <w:rPr>
+                <w:rFonts w:ascii="Calibri" w:cs="Calibri" w:eastAsia="Calibri" w:hAnsi="Calibri"/>
+                <w:b/>
+                <w:bCs/>
+                <w:color w:val="FFFFFF"/>
+                <w:sz w:val="20"/>
+                <w:szCs w:val="20"/>
+              </w:rPr>
+              <w:t xml:space="preserve">Nullable</w:t>
+            </w:r>
+          </w:p>
+        </w:tc>
+        <w:tc>
+          <w:tcPr>
+            <w:tcW w:type="dxa" w:w="2010"/>
+            <w:shd w:fill="1F3864" w:val="clear"/>
+            <w:tcMar>
+              <w:top w:type="dxa" w:w="80"/>
+              <w:left w:type="dxa" w:w="100"/>
+              <w:bottom w:type="dxa" w:w="80"/>
+              <w:right w:type="dxa" w:w="100"/>
+            </w:tcMar>
+            <w:vAlign w:val="center"/>
+          </w:tcPr>
+          <w:p>
+            <w:pPr>
+              <w:jc w:val="left"/>
+            </w:pPr>
+            <w:r>
+              <w:rPr>
+                <w:rFonts w:ascii="Calibri" w:cs="Calibri" w:eastAsia="Calibri" w:hAnsi="Calibri"/>
+                <w:b/>
+                <w:bCs/>
+                <w:color w:val="FFFFFF"/>
+                <w:sz w:val="20"/>
+                <w:szCs w:val="20"/>
+              </w:rPr>
+              <w:t xml:space="preserve">Index/Key</w:t>
+            </w:r>
+          </w:p>
+        </w:tc>
+        <w:tc>
+          <w:tcPr>
+            <w:tcW w:type="dxa" w:w="4030"/>
+            <w:shd w:fill="1F3864" w:val="clear"/>
+            <w:tcMar>
+              <w:top w:type="dxa" w:w="80"/>
+              <w:left w:type="dxa" w:w="100"/>
+              <w:bottom w:type="dxa" w:w="80"/>
+              <w:right w:type="dxa" w:w="100"/>
+            </w:tcMar>
+            <w:vAlign w:val="center"/>
+          </w:tcPr>
+          <w:p>
+            <w:pPr>
+              <w:jc w:val="left"/>
+            </w:pPr>
+            <w:r>
+              <w:rPr>
+                <w:rFonts w:ascii="Calibri" w:cs="Calibri" w:eastAsia="Calibri" w:hAnsi="Calibri"/>
+                <w:b/>
+                <w:bCs/>
+                <w:color w:val="FFFFFF"/>
+                <w:sz w:val="20"/>
+                <w:szCs w:val="20"/>
+              </w:rPr>
+              <w:t xml:space="preserve">Ghi chú</w:t>
+            </w:r>
+          </w:p>
+        </w:tc>
+      </w:tr>
+      <w:tr>
+        <w:tc>
+          <w:tcPr>
+            <w:tcW w:type="dxa" w:w="1650"/>
+            <w:tcMar>
+              <w:top w:type="dxa" w:w="80"/>
+              <w:left w:type="dxa" w:w="100"/>
+              <w:bottom w:type="dxa" w:w="80"/>
+              <w:right w:type="dxa" w:w="100"/>
+            </w:tcMar>
+            <w:vAlign w:val="center"/>
+          </w:tcPr>
+          <w:p>
+            <w:pPr>
+              <w:jc w:val="left"/>
+            </w:pPr>
+            <w:r>
+              <w:rPr>
+                <w:rFonts w:ascii="Calibri" w:cs="Calibri" w:eastAsia="Calibri" w:hAnsi="Calibri"/>
+                <w:b w:val="false"/>
+                <w:bCs w:val="false"/>
+                <w:sz w:val="20"/>
+                <w:szCs w:val="20"/>
+              </w:rPr>
+              <w:t xml:space="preserve">Id</w:t>
+            </w:r>
+          </w:p>
+        </w:tc>
+        <w:tc>
+          <w:tcPr>
+            <w:tcW w:type="dxa" w:w="1650"/>
+            <w:tcMar>
+              <w:top w:type="dxa" w:w="80"/>
+              <w:left w:type="dxa" w:w="100"/>
+              <w:bottom w:type="dxa" w:w="80"/>
+              <w:right w:type="dxa" w:w="100"/>
+            </w:tcMar>
+            <w:vAlign w:val="center"/>
+          </w:tcPr>
+          <w:p>
+            <w:pPr>
+              <w:jc w:val="left"/>
+            </w:pPr>
+            <w:r>
+              <w:rPr>
+                <w:rFonts w:ascii="Calibri" w:cs="Calibri" w:eastAsia="Calibri" w:hAnsi="Calibri"/>
+                <w:b w:val="false"/>
+                <w:bCs w:val="false"/>
+                <w:sz w:val="20"/>
+                <w:szCs w:val="20"/>
+              </w:rPr>
+              <w:t xml:space="preserve">uniqueidentifier</w:t>
+            </w:r>
+          </w:p>
+        </w:tc>
+        <w:tc>
+          <w:tcPr>
+            <w:tcW w:type="dxa" w:w="1100"/>
+            <w:tcMar>
+              <w:top w:type="dxa" w:w="80"/>
+              <w:left w:type="dxa" w:w="100"/>
+              <w:bottom w:type="dxa" w:w="80"/>
+              <w:right w:type="dxa" w:w="100"/>
+            </w:tcMar>
+            <w:vAlign w:val="center"/>
+          </w:tcPr>
+          <w:p>
+            <w:pPr>
+              <w:jc w:val="left"/>
+            </w:pPr>
+            <w:r>
+              <w:rPr>
+                <w:rFonts w:ascii="Calibri" w:cs="Calibri" w:eastAsia="Calibri" w:hAnsi="Calibri"/>
+                <w:b w:val="false"/>
+                <w:bCs w:val="false"/>
+                <w:sz w:val="20"/>
+                <w:szCs w:val="20"/>
+              </w:rPr>
+              <w:t xml:space="preserve">Không</w:t>
+            </w:r>
+          </w:p>
+        </w:tc>
+        <w:tc>
+          <w:tcPr>
+            <w:tcW w:type="dxa" w:w="2010"/>
+            <w:tcMar>
+              <w:top w:type="dxa" w:w="80"/>
+              <w:left w:type="dxa" w:w="100"/>
+              <w:bottom w:type="dxa" w:w="80"/>
+              <w:right w:type="dxa" w:w="100"/>
+            </w:tcMar>
+            <w:vAlign w:val="center"/>
+          </w:tcPr>
+          <w:p>
+            <w:pPr>
+              <w:jc w:val="left"/>
+            </w:pPr>
+            <w:r>
+              <w:rPr>
+                <w:rFonts w:ascii="Calibri" w:cs="Calibri" w:eastAsia="Calibri" w:hAnsi="Calibri"/>
+                <w:b w:val="false"/>
+                <w:bCs w:val="false"/>
+                <w:sz w:val="20"/>
+                <w:szCs w:val="20"/>
+              </w:rPr>
+              <w:t xml:space="preserve">PK</w:t>
+            </w:r>
+          </w:p>
+        </w:tc>
+        <w:tc>
+          <w:tcPr>
+            <w:tcW w:type="dxa" w:w="4030"/>
+            <w:tcMar>
+              <w:top w:type="dxa" w:w="80"/>
+              <w:left w:type="dxa" w:w="100"/>
+              <w:bottom w:type="dxa" w:w="80"/>
+              <w:right w:type="dxa" w:w="100"/>
+            </w:tcMar>
+            <w:vAlign w:val="center"/>
+          </w:tcPr>
+          <w:p>
+            <w:pPr>
+              <w:jc w:val="left"/>
+            </w:pPr>
+            <w:r>
+              <w:rPr>
+                <w:rFonts w:ascii="Calibri" w:cs="Calibri" w:eastAsia="Calibri" w:hAnsi="Calibri"/>
+                <w:b w:val="false"/>
+                <w:bCs w:val="false"/>
+                <w:sz w:val="20"/>
+                <w:szCs w:val="20"/>
+              </w:rPr>
+              <w:t xml:space="preserve">Ứng dụng sinh GUID</w:t>
+            </w:r>
+          </w:p>
+        </w:tc>
+      </w:tr>
+      <w:tr>
+        <w:tc>
+          <w:tcPr>
+            <w:tcW w:type="dxa" w:w="1650"/>
+            <w:shd w:fill="F2F6FB" w:val="clear"/>
+            <w:tcMar>
+              <w:top w:type="dxa" w:w="80"/>
+              <w:left w:type="dxa" w:w="100"/>
+              <w:bottom w:type="dxa" w:w="80"/>
+              <w:right w:type="dxa" w:w="100"/>
+            </w:tcMar>
+            <w:vAlign w:val="center"/>
+          </w:tcPr>
+          <w:p>
+            <w:pPr>
+              <w:jc w:val="left"/>
+            </w:pPr>
+            <w:r>
+              <w:rPr>
+                <w:rFonts w:ascii="Calibri" w:cs="Calibri" w:eastAsia="Calibri" w:hAnsi="Calibri"/>
+                <w:b w:val="false"/>
+                <w:bCs w:val="false"/>
+                <w:sz w:val="20"/>
+                <w:szCs w:val="20"/>
+              </w:rPr>
+              <w:t xml:space="preserve">EntityName</w:t>
+            </w:r>
+          </w:p>
+        </w:tc>
+        <w:tc>
+          <w:tcPr>
+            <w:tcW w:type="dxa" w:w="1650"/>
+            <w:shd w:fill="F2F6FB" w:val="clear"/>
+            <w:tcMar>
+              <w:top w:type="dxa" w:w="80"/>
+              <w:left w:type="dxa" w:w="100"/>
+              <w:bottom w:type="dxa" w:w="80"/>
+              <w:right w:type="dxa" w:w="100"/>
+            </w:tcMar>
+            <w:vAlign w:val="center"/>
+          </w:tcPr>
+          <w:p>
+            <w:pPr>
+              <w:jc w:val="left"/>
+            </w:pPr>
+            <w:r>
+              <w:rPr>
+                <w:rFonts w:ascii="Calibri" w:cs="Calibri" w:eastAsia="Calibri" w:hAnsi="Calibri"/>
+                <w:b w:val="false"/>
+                <w:bCs w:val="false"/>
+                <w:sz w:val="20"/>
+                <w:szCs w:val="20"/>
+              </w:rPr>
+              <w:t xml:space="preserve">nvarchar(100)</w:t>
+            </w:r>
+          </w:p>
+        </w:tc>
+        <w:tc>
+          <w:tcPr>
+            <w:tcW w:type="dxa" w:w="1100"/>
+            <w:shd w:fill="F2F6FB" w:val="clear"/>
+            <w:tcMar>
+              <w:top w:type="dxa" w:w="80"/>
+              <w:left w:type="dxa" w:w="100"/>
+              <w:bottom w:type="dxa" w:w="80"/>
+              <w:right w:type="dxa" w:w="100"/>
+            </w:tcMar>
+            <w:vAlign w:val="center"/>
+          </w:tcPr>
+          <w:p>
+            <w:pPr>
+              <w:jc w:val="left"/>
+            </w:pPr>
+            <w:r>
+              <w:rPr>
+                <w:rFonts w:ascii="Calibri" w:cs="Calibri" w:eastAsia="Calibri" w:hAnsi="Calibri"/>
+                <w:b w:val="false"/>
+                <w:bCs w:val="false"/>
+                <w:sz w:val="20"/>
+                <w:szCs w:val="20"/>
+              </w:rPr>
+              <w:t xml:space="preserve">Không</w:t>
+            </w:r>
+          </w:p>
+        </w:tc>
+        <w:tc>
+          <w:tcPr>
+            <w:tcW w:type="dxa" w:w="2010"/>
+            <w:shd w:fill="F2F6FB" w:val="clear"/>
+            <w:tcMar>
+              <w:top w:type="dxa" w:w="80"/>
+              <w:left w:type="dxa" w:w="100"/>
+              <w:bottom w:type="dxa" w:w="80"/>
+              <w:right w:type="dxa" w:w="100"/>
+            </w:tcMar>
+            <w:vAlign w:val="center"/>
+          </w:tcPr>
+          <w:p>
+            <w:pPr>
+              <w:jc w:val="left"/>
+            </w:pPr>
+            <w:r>
+              <w:rPr>
+                <w:rFonts w:ascii="Calibri" w:cs="Calibri" w:eastAsia="Calibri" w:hAnsi="Calibri"/>
+                <w:b w:val="false"/>
+                <w:bCs w:val="false"/>
+                <w:sz w:val="20"/>
+                <w:szCs w:val="20"/>
+              </w:rPr>
+              <w:t xml:space="preserve">Index (cùng EntityId, Timestamp)</w:t>
+            </w:r>
+          </w:p>
+        </w:tc>
+        <w:tc>
+          <w:tcPr>
+            <w:tcW w:type="dxa" w:w="4030"/>
+            <w:shd w:fill="F2F6FB" w:val="clear"/>
+            <w:tcMar>
+              <w:top w:type="dxa" w:w="80"/>
+              <w:left w:type="dxa" w:w="100"/>
+              <w:bottom w:type="dxa" w:w="80"/>
+              <w:right w:type="dxa" w:w="100"/>
+            </w:tcMar>
+            <w:vAlign w:val="center"/>
+          </w:tcPr>
+          <w:p>
+            <w:pPr>
+              <w:jc w:val="left"/>
+            </w:pPr>
+            <w:r>
+              <w:rPr>
+                <w:rFonts w:ascii="Calibri" w:cs="Calibri" w:eastAsia="Calibri" w:hAnsi="Calibri"/>
+                <w:b w:val="false"/>
+                <w:bCs w:val="false"/>
+                <w:sz w:val="20"/>
+                <w:szCs w:val="20"/>
+              </w:rPr>
+              <w:t xml:space="preserve">Tên entity được ghi vết, hiện tại là "Customer"</w:t>
+            </w:r>
+          </w:p>
+        </w:tc>
+      </w:tr>
+      <w:tr>
+        <w:tc>
+          <w:tcPr>
+            <w:tcW w:type="dxa" w:w="1650"/>
+            <w:tcMar>
+              <w:top w:type="dxa" w:w="80"/>
+              <w:left w:type="dxa" w:w="100"/>
+              <w:bottom w:type="dxa" w:w="80"/>
+              <w:right w:type="dxa" w:w="100"/>
+            </w:tcMar>
+            <w:vAlign w:val="center"/>
+          </w:tcPr>
+          <w:p>
+            <w:pPr>
+              <w:jc w:val="left"/>
+            </w:pPr>
+            <w:r>
+              <w:rPr>
+                <w:rFonts w:ascii="Calibri" w:cs="Calibri" w:eastAsia="Calibri" w:hAnsi="Calibri"/>
+                <w:b w:val="false"/>
+                <w:bCs w:val="false"/>
+                <w:sz w:val="20"/>
+                <w:szCs w:val="20"/>
+              </w:rPr>
+              <w:t xml:space="preserve">EntityId</w:t>
+            </w:r>
+          </w:p>
+        </w:tc>
+        <w:tc>
+          <w:tcPr>
+            <w:tcW w:type="dxa" w:w="1650"/>
+            <w:tcMar>
+              <w:top w:type="dxa" w:w="80"/>
+              <w:left w:type="dxa" w:w="100"/>
+              <w:bottom w:type="dxa" w:w="80"/>
+              <w:right w:type="dxa" w:w="100"/>
+            </w:tcMar>
+            <w:vAlign w:val="center"/>
+          </w:tcPr>
+          <w:p>
+            <w:pPr>
+              <w:jc w:val="left"/>
+            </w:pPr>
+            <w:r>
+              <w:rPr>
+                <w:rFonts w:ascii="Calibri" w:cs="Calibri" w:eastAsia="Calibri" w:hAnsi="Calibri"/>
+                <w:b w:val="false"/>
+                <w:bCs w:val="false"/>
+                <w:sz w:val="20"/>
+                <w:szCs w:val="20"/>
+              </w:rPr>
+              <w:t xml:space="preserve">nvarchar(100)</w:t>
+            </w:r>
+          </w:p>
+        </w:tc>
+        <w:tc>
+          <w:tcPr>
+            <w:tcW w:type="dxa" w:w="1100"/>
+            <w:tcMar>
+              <w:top w:type="dxa" w:w="80"/>
+              <w:left w:type="dxa" w:w="100"/>
+              <w:bottom w:type="dxa" w:w="80"/>
+              <w:right w:type="dxa" w:w="100"/>
+            </w:tcMar>
+            <w:vAlign w:val="center"/>
+          </w:tcPr>
+          <w:p>
+            <w:pPr>
+              <w:jc w:val="left"/>
+            </w:pPr>
+            <w:r>
+              <w:rPr>
+                <w:rFonts w:ascii="Calibri" w:cs="Calibri" w:eastAsia="Calibri" w:hAnsi="Calibri"/>
+                <w:b w:val="false"/>
+                <w:bCs w:val="false"/>
+                <w:sz w:val="20"/>
+                <w:szCs w:val="20"/>
+              </w:rPr>
+              <w:t xml:space="preserve">Không</w:t>
+            </w:r>
+          </w:p>
+        </w:tc>
+        <w:tc>
+          <w:tcPr>
+            <w:tcW w:type="dxa" w:w="2010"/>
+            <w:tcMar>
+              <w:top w:type="dxa" w:w="80"/>
+              <w:left w:type="dxa" w:w="100"/>
+              <w:bottom w:type="dxa" w:w="80"/>
+              <w:right w:type="dxa" w:w="100"/>
+            </w:tcMar>
+            <w:vAlign w:val="center"/>
+          </w:tcPr>
+          <w:p>
+            <w:pPr>
+              <w:jc w:val="left"/>
+            </w:pPr>
+            <w:r>
+              <w:rPr>
+                <w:rFonts w:ascii="Calibri" w:cs="Calibri" w:eastAsia="Calibri" w:hAnsi="Calibri"/>
+                <w:b w:val="false"/>
+                <w:bCs w:val="false"/>
+                <w:sz w:val="20"/>
+                <w:szCs w:val="20"/>
+              </w:rPr>
+              <w:t xml:space="preserve">Index (cùng EntityName, Timestamp)</w:t>
+            </w:r>
+          </w:p>
+        </w:tc>
+        <w:tc>
+          <w:tcPr>
+            <w:tcW w:type="dxa" w:w="4030"/>
+            <w:tcMar>
+              <w:top w:type="dxa" w:w="80"/>
+              <w:left w:type="dxa" w:w="100"/>
+              <w:bottom w:type="dxa" w:w="80"/>
+              <w:right w:type="dxa" w:w="100"/>
+            </w:tcMar>
+            <w:vAlign w:val="center"/>
+          </w:tcPr>
+          <w:p>
+            <w:pPr>
+              <w:jc w:val="left"/>
+            </w:pPr>
+            <w:r>
+              <w:rPr>
+                <w:rFonts w:ascii="Calibri" w:cs="Calibri" w:eastAsia="Calibri" w:hAnsi="Calibri"/>
+                <w:b w:val="false"/>
+                <w:bCs w:val="false"/>
+                <w:sz w:val="20"/>
+                <w:szCs w:val="20"/>
+              </w:rPr>
+              <w:t xml:space="preserve">Id bản ghi dạng chuỗi — cố ý không FK (xem 2.7)</w:t>
+            </w:r>
+          </w:p>
+        </w:tc>
+      </w:tr>
+      <w:tr>
+        <w:tc>
+          <w:tcPr>
+            <w:tcW w:type="dxa" w:w="1650"/>
+            <w:shd w:fill="F2F6FB" w:val="clear"/>
+            <w:tcMar>
+              <w:top w:type="dxa" w:w="80"/>
+              <w:left w:type="dxa" w:w="100"/>
+              <w:bottom w:type="dxa" w:w="80"/>
+              <w:right w:type="dxa" w:w="100"/>
+            </w:tcMar>
+            <w:vAlign w:val="center"/>
+          </w:tcPr>
+          <w:p>
+            <w:pPr>
+              <w:jc w:val="left"/>
+            </w:pPr>
+            <w:r>
+              <w:rPr>
+                <w:rFonts w:ascii="Calibri" w:cs="Calibri" w:eastAsia="Calibri" w:hAnsi="Calibri"/>
+                <w:b w:val="false"/>
+                <w:bCs w:val="false"/>
+                <w:sz w:val="20"/>
+                <w:szCs w:val="20"/>
+              </w:rPr>
+              <w:t xml:space="preserve">Action</w:t>
+            </w:r>
+          </w:p>
+        </w:tc>
+        <w:tc>
+          <w:tcPr>
+            <w:tcW w:type="dxa" w:w="1650"/>
+            <w:shd w:fill="F2F6FB" w:val="clear"/>
+            <w:tcMar>
+              <w:top w:type="dxa" w:w="80"/>
+              <w:left w:type="dxa" w:w="100"/>
+              <w:bottom w:type="dxa" w:w="80"/>
+              <w:right w:type="dxa" w:w="100"/>
+            </w:tcMar>
+            <w:vAlign w:val="center"/>
+          </w:tcPr>
+          <w:p>
+            <w:pPr>
+              <w:jc w:val="left"/>
+            </w:pPr>
+            <w:r>
+              <w:rPr>
+                <w:rFonts w:ascii="Calibri" w:cs="Calibri" w:eastAsia="Calibri" w:hAnsi="Calibri"/>
+                <w:b w:val="false"/>
+                <w:bCs w:val="false"/>
+                <w:sz w:val="20"/>
+                <w:szCs w:val="20"/>
+              </w:rPr>
+              <w:t xml:space="preserve">nvarchar(20)</w:t>
+            </w:r>
+          </w:p>
+        </w:tc>
+        <w:tc>
+          <w:tcPr>
+            <w:tcW w:type="dxa" w:w="1100"/>
+            <w:shd w:fill="F2F6FB" w:val="clear"/>
+            <w:tcMar>
+              <w:top w:type="dxa" w:w="80"/>
+              <w:left w:type="dxa" w:w="100"/>
+              <w:bottom w:type="dxa" w:w="80"/>
+              <w:right w:type="dxa" w:w="100"/>
+            </w:tcMar>
+            <w:vAlign w:val="center"/>
+          </w:tcPr>
+          <w:p>
+            <w:pPr>
+              <w:jc w:val="left"/>
+            </w:pPr>
+            <w:r>
+              <w:rPr>
+                <w:rFonts w:ascii="Calibri" w:cs="Calibri" w:eastAsia="Calibri" w:hAnsi="Calibri"/>
+                <w:b w:val="false"/>
+                <w:bCs w:val="false"/>
+                <w:sz w:val="20"/>
+                <w:szCs w:val="20"/>
+              </w:rPr>
+              <w:t xml:space="preserve">Không</w:t>
+            </w:r>
+          </w:p>
+        </w:tc>
+        <w:tc>
+          <w:tcPr>
+            <w:tcW w:type="dxa" w:w="2010"/>
+            <w:shd w:fill="F2F6FB" w:val="clear"/>
+            <w:tcMar>
+              <w:top w:type="dxa" w:w="80"/>
+              <w:left w:type="dxa" w:w="100"/>
+              <w:bottom w:type="dxa" w:w="80"/>
+              <w:right w:type="dxa" w:w="100"/>
+            </w:tcMar>
+            <w:vAlign w:val="center"/>
+          </w:tcPr>
+          <w:p>
+            <w:pPr>
+              <w:jc w:val="left"/>
+            </w:pPr>
+            <w:r>
+              <w:rPr>
+                <w:rFonts w:ascii="Calibri" w:cs="Calibri" w:eastAsia="Calibri" w:hAnsi="Calibri"/>
+                <w:b w:val="false"/>
+                <w:bCs w:val="false"/>
+                <w:sz w:val="20"/>
+                <w:szCs w:val="20"/>
+              </w:rPr>
+              <w:t xml:space="preserve">—</w:t>
+            </w:r>
+          </w:p>
+        </w:tc>
+        <w:tc>
+          <w:tcPr>
+            <w:tcW w:type="dxa" w:w="4030"/>
+            <w:shd w:fill="F2F6FB" w:val="clear"/>
+            <w:tcMar>
+              <w:top w:type="dxa" w:w="80"/>
+              <w:left w:type="dxa" w:w="100"/>
+              <w:bottom w:type="dxa" w:w="80"/>
+              <w:right w:type="dxa" w:w="100"/>
+            </w:tcMar>
+            <w:vAlign w:val="center"/>
+          </w:tcPr>
+          <w:p>
+            <w:pPr>
+              <w:jc w:val="left"/>
+            </w:pPr>
+            <w:r>
+              <w:rPr>
+                <w:rFonts w:ascii="Calibri" w:cs="Calibri" w:eastAsia="Calibri" w:hAnsi="Calibri"/>
+                <w:b w:val="false"/>
+                <w:bCs w:val="false"/>
+                <w:sz w:val="20"/>
+                <w:szCs w:val="20"/>
+              </w:rPr>
+              <w:t xml:space="preserve">Added / Modified / Deleted (xóa mềm được ghi là Deleted)</w:t>
+            </w:r>
+          </w:p>
+        </w:tc>
+      </w:tr>
+      <w:tr>
+        <w:tc>
+          <w:tcPr>
+            <w:tcW w:type="dxa" w:w="1650"/>
+            <w:tcMar>
+              <w:top w:type="dxa" w:w="80"/>
+              <w:left w:type="dxa" w:w="100"/>
+              <w:bottom w:type="dxa" w:w="80"/>
+              <w:right w:type="dxa" w:w="100"/>
+            </w:tcMar>
+            <w:vAlign w:val="center"/>
+          </w:tcPr>
+          <w:p>
+            <w:pPr>
+              <w:jc w:val="left"/>
+            </w:pPr>
+            <w:r>
+              <w:rPr>
+                <w:rFonts w:ascii="Calibri" w:cs="Calibri" w:eastAsia="Calibri" w:hAnsi="Calibri"/>
+                <w:b w:val="false"/>
+                <w:bCs w:val="false"/>
+                <w:sz w:val="20"/>
+                <w:szCs w:val="20"/>
+              </w:rPr>
+              <w:t xml:space="preserve">OldValues</w:t>
+            </w:r>
+          </w:p>
+        </w:tc>
+        <w:tc>
+          <w:tcPr>
+            <w:tcW w:type="dxa" w:w="1650"/>
+            <w:tcMar>
+              <w:top w:type="dxa" w:w="80"/>
+              <w:left w:type="dxa" w:w="100"/>
+              <w:bottom w:type="dxa" w:w="80"/>
+              <w:right w:type="dxa" w:w="100"/>
+            </w:tcMar>
+            <w:vAlign w:val="center"/>
+          </w:tcPr>
+          <w:p>
+            <w:pPr>
+              <w:jc w:val="left"/>
+            </w:pPr>
+            <w:r>
+              <w:rPr>
+                <w:rFonts w:ascii="Calibri" w:cs="Calibri" w:eastAsia="Calibri" w:hAnsi="Calibri"/>
+                <w:b w:val="false"/>
+                <w:bCs w:val="false"/>
+                <w:sz w:val="20"/>
+                <w:szCs w:val="20"/>
+              </w:rPr>
+              <w:t xml:space="preserve">nvarchar(max)</w:t>
+            </w:r>
+          </w:p>
+        </w:tc>
+        <w:tc>
+          <w:tcPr>
+            <w:tcW w:type="dxa" w:w="1100"/>
+            <w:tcMar>
+              <w:top w:type="dxa" w:w="80"/>
+              <w:left w:type="dxa" w:w="100"/>
+              <w:bottom w:type="dxa" w:w="80"/>
+              <w:right w:type="dxa" w:w="100"/>
+            </w:tcMar>
+            <w:vAlign w:val="center"/>
+          </w:tcPr>
+          <w:p>
+            <w:pPr>
+              <w:jc w:val="left"/>
+            </w:pPr>
+            <w:r>
+              <w:rPr>
+                <w:rFonts w:ascii="Calibri" w:cs="Calibri" w:eastAsia="Calibri" w:hAnsi="Calibri"/>
+                <w:b w:val="false"/>
+                <w:bCs w:val="false"/>
+                <w:sz w:val="20"/>
+                <w:szCs w:val="20"/>
+              </w:rPr>
+              <w:t xml:space="preserve">Có</w:t>
+            </w:r>
+          </w:p>
+        </w:tc>
+        <w:tc>
+          <w:tcPr>
+            <w:tcW w:type="dxa" w:w="2010"/>
+            <w:tcMar>
+              <w:top w:type="dxa" w:w="80"/>
+              <w:left w:type="dxa" w:w="100"/>
+              <w:bottom w:type="dxa" w:w="80"/>
+              <w:right w:type="dxa" w:w="100"/>
+            </w:tcMar>
+            <w:vAlign w:val="center"/>
+          </w:tcPr>
+          <w:p>
+            <w:pPr>
+              <w:jc w:val="left"/>
+            </w:pPr>
+            <w:r>
+              <w:rPr>
+                <w:rFonts w:ascii="Calibri" w:cs="Calibri" w:eastAsia="Calibri" w:hAnsi="Calibri"/>
+                <w:b w:val="false"/>
+                <w:bCs w:val="false"/>
+                <w:sz w:val="20"/>
+                <w:szCs w:val="20"/>
+              </w:rPr>
+              <w:t xml:space="preserve">—</w:t>
+            </w:r>
+          </w:p>
+        </w:tc>
+        <w:tc>
+          <w:tcPr>
+            <w:tcW w:type="dxa" w:w="4030"/>
+            <w:tcMar>
+              <w:top w:type="dxa" w:w="80"/>
+              <w:left w:type="dxa" w:w="100"/>
+              <w:bottom w:type="dxa" w:w="80"/>
+              <w:right w:type="dxa" w:w="100"/>
+            </w:tcMar>
+            <w:vAlign w:val="center"/>
+          </w:tcPr>
+          <w:p>
+            <w:pPr>
+              <w:jc w:val="left"/>
+            </w:pPr>
+            <w:r>
+              <w:rPr>
+                <w:rFonts w:ascii="Calibri" w:cs="Calibri" w:eastAsia="Calibri" w:hAnsi="Calibri"/>
+                <w:b w:val="false"/>
+                <w:bCs w:val="false"/>
+                <w:sz w:val="20"/>
+                <w:szCs w:val="20"/>
+              </w:rPr>
+              <w:t xml:space="preserve">JSON các field thay đổi — giá trị cũ (null khi Added)</w:t>
+            </w:r>
+          </w:p>
+        </w:tc>
+      </w:tr>
+      <w:tr>
+        <w:tc>
+          <w:tcPr>
+            <w:tcW w:type="dxa" w:w="1650"/>
+            <w:shd w:fill="F2F6FB" w:val="clear"/>
+            <w:tcMar>
+              <w:top w:type="dxa" w:w="80"/>
+              <w:left w:type="dxa" w:w="100"/>
+              <w:bottom w:type="dxa" w:w="80"/>
+              <w:right w:type="dxa" w:w="100"/>
+            </w:tcMar>
+            <w:vAlign w:val="center"/>
+          </w:tcPr>
+          <w:p>
+            <w:pPr>
+              <w:jc w:val="left"/>
+            </w:pPr>
+            <w:r>
+              <w:rPr>
+                <w:rFonts w:ascii="Calibri" w:cs="Calibri" w:eastAsia="Calibri" w:hAnsi="Calibri"/>
+                <w:b w:val="false"/>
+                <w:bCs w:val="false"/>
+                <w:sz w:val="20"/>
+                <w:szCs w:val="20"/>
+              </w:rPr>
+              <w:t xml:space="preserve">NewValues</w:t>
+            </w:r>
+          </w:p>
+        </w:tc>
+        <w:tc>
+          <w:tcPr>
+            <w:tcW w:type="dxa" w:w="1650"/>
+            <w:shd w:fill="F2F6FB" w:val="clear"/>
+            <w:tcMar>
+              <w:top w:type="dxa" w:w="80"/>
+              <w:left w:type="dxa" w:w="100"/>
+              <w:bottom w:type="dxa" w:w="80"/>
+              <w:right w:type="dxa" w:w="100"/>
+            </w:tcMar>
+            <w:vAlign w:val="center"/>
+          </w:tcPr>
+          <w:p>
+            <w:pPr>
+              <w:jc w:val="left"/>
+            </w:pPr>
+            <w:r>
+              <w:rPr>
+                <w:rFonts w:ascii="Calibri" w:cs="Calibri" w:eastAsia="Calibri" w:hAnsi="Calibri"/>
+                <w:b w:val="false"/>
+                <w:bCs w:val="false"/>
+                <w:sz w:val="20"/>
+                <w:szCs w:val="20"/>
+              </w:rPr>
+              <w:t xml:space="preserve">nvarchar(max)</w:t>
+            </w:r>
+          </w:p>
+        </w:tc>
+        <w:tc>
+          <w:tcPr>
+            <w:tcW w:type="dxa" w:w="1100"/>
+            <w:shd w:fill="F2F6FB" w:val="clear"/>
+            <w:tcMar>
+              <w:top w:type="dxa" w:w="80"/>
+              <w:left w:type="dxa" w:w="100"/>
+              <w:bottom w:type="dxa" w:w="80"/>
+              <w:right w:type="dxa" w:w="100"/>
+            </w:tcMar>
+            <w:vAlign w:val="center"/>
+          </w:tcPr>
+          <w:p>
+            <w:pPr>
+              <w:jc w:val="left"/>
+            </w:pPr>
+            <w:r>
+              <w:rPr>
+                <w:rFonts w:ascii="Calibri" w:cs="Calibri" w:eastAsia="Calibri" w:hAnsi="Calibri"/>
+                <w:b w:val="false"/>
+                <w:bCs w:val="false"/>
+                <w:sz w:val="20"/>
+                <w:szCs w:val="20"/>
+              </w:rPr>
+              <w:t xml:space="preserve">Có</w:t>
+            </w:r>
+          </w:p>
+        </w:tc>
+        <w:tc>
+          <w:tcPr>
+            <w:tcW w:type="dxa" w:w="2010"/>
+            <w:shd w:fill="F2F6FB" w:val="clear"/>
+            <w:tcMar>
+              <w:top w:type="dxa" w:w="80"/>
+              <w:left w:type="dxa" w:w="100"/>
+              <w:bottom w:type="dxa" w:w="80"/>
+              <w:right w:type="dxa" w:w="100"/>
+            </w:tcMar>
+            <w:vAlign w:val="center"/>
+          </w:tcPr>
+          <w:p>
+            <w:pPr>
+              <w:jc w:val="left"/>
+            </w:pPr>
+            <w:r>
+              <w:rPr>
+                <w:rFonts w:ascii="Calibri" w:cs="Calibri" w:eastAsia="Calibri" w:hAnsi="Calibri"/>
+                <w:b w:val="false"/>
+                <w:bCs w:val="false"/>
+                <w:sz w:val="20"/>
+                <w:szCs w:val="20"/>
+              </w:rPr>
+              <w:t xml:space="preserve">—</w:t>
+            </w:r>
+          </w:p>
+        </w:tc>
+        <w:tc>
+          <w:tcPr>
+            <w:tcW w:type="dxa" w:w="4030"/>
+            <w:shd w:fill="F2F6FB" w:val="clear"/>
+            <w:tcMar>
+              <w:top w:type="dxa" w:w="80"/>
+              <w:left w:type="dxa" w:w="100"/>
+              <w:bottom w:type="dxa" w:w="80"/>
+              <w:right w:type="dxa" w:w="100"/>
+            </w:tcMar>
+            <w:vAlign w:val="center"/>
+          </w:tcPr>
+          <w:p>
+            <w:pPr>
+              <w:jc w:val="left"/>
+            </w:pPr>
+            <w:r>
+              <w:rPr>
+                <w:rFonts w:ascii="Calibri" w:cs="Calibri" w:eastAsia="Calibri" w:hAnsi="Calibri"/>
+                <w:b w:val="false"/>
+                <w:bCs w:val="false"/>
+                <w:sz w:val="20"/>
+                <w:szCs w:val="20"/>
+              </w:rPr>
+              <w:t xml:space="preserve">JSON các field thay đổi — giá trị mới</w:t>
+            </w:r>
+          </w:p>
+        </w:tc>
+      </w:tr>
+      <w:tr>
+        <w:tc>
+          <w:tcPr>
+            <w:tcW w:type="dxa" w:w="1650"/>
+            <w:tcMar>
+              <w:top w:type="dxa" w:w="80"/>
+              <w:left w:type="dxa" w:w="100"/>
+              <w:bottom w:type="dxa" w:w="80"/>
+              <w:right w:type="dxa" w:w="100"/>
+            </w:tcMar>
+            <w:vAlign w:val="center"/>
+          </w:tcPr>
+          <w:p>
+            <w:pPr>
+              <w:jc w:val="left"/>
+            </w:pPr>
+            <w:r>
+              <w:rPr>
+                <w:rFonts w:ascii="Calibri" w:cs="Calibri" w:eastAsia="Calibri" w:hAnsi="Calibri"/>
+                <w:b w:val="false"/>
+                <w:bCs w:val="false"/>
+                <w:sz w:val="20"/>
+                <w:szCs w:val="20"/>
+              </w:rPr>
+              <w:t xml:space="preserve">UserName</w:t>
+            </w:r>
+          </w:p>
+        </w:tc>
+        <w:tc>
+          <w:tcPr>
+            <w:tcW w:type="dxa" w:w="1650"/>
+            <w:tcMar>
+              <w:top w:type="dxa" w:w="80"/>
+              <w:left w:type="dxa" w:w="100"/>
+              <w:bottom w:type="dxa" w:w="80"/>
+              <w:right w:type="dxa" w:w="100"/>
+            </w:tcMar>
+            <w:vAlign w:val="center"/>
+          </w:tcPr>
+          <w:p>
+            <w:pPr>
+              <w:jc w:val="left"/>
+            </w:pPr>
+            <w:r>
+              <w:rPr>
+                <w:rFonts w:ascii="Calibri" w:cs="Calibri" w:eastAsia="Calibri" w:hAnsi="Calibri"/>
+                <w:b w:val="false"/>
+                <w:bCs w:val="false"/>
+                <w:sz w:val="20"/>
+                <w:szCs w:val="20"/>
+              </w:rPr>
+              <w:t xml:space="preserve">nvarchar(50)</w:t>
+            </w:r>
+          </w:p>
+        </w:tc>
+        <w:tc>
+          <w:tcPr>
+            <w:tcW w:type="dxa" w:w="1100"/>
+            <w:tcMar>
+              <w:top w:type="dxa" w:w="80"/>
+              <w:left w:type="dxa" w:w="100"/>
+              <w:bottom w:type="dxa" w:w="80"/>
+              <w:right w:type="dxa" w:w="100"/>
+            </w:tcMar>
+            <w:vAlign w:val="center"/>
+          </w:tcPr>
+          <w:p>
+            <w:pPr>
+              <w:jc w:val="left"/>
+            </w:pPr>
+            <w:r>
+              <w:rPr>
+                <w:rFonts w:ascii="Calibri" w:cs="Calibri" w:eastAsia="Calibri" w:hAnsi="Calibri"/>
+                <w:b w:val="false"/>
+                <w:bCs w:val="false"/>
+                <w:sz w:val="20"/>
+                <w:szCs w:val="20"/>
+              </w:rPr>
+              <w:t xml:space="preserve">Không</w:t>
+            </w:r>
+          </w:p>
+        </w:tc>
+        <w:tc>
+          <w:tcPr>
+            <w:tcW w:type="dxa" w:w="2010"/>
+            <w:tcMar>
+              <w:top w:type="dxa" w:w="80"/>
+              <w:left w:type="dxa" w:w="100"/>
+              <w:bottom w:type="dxa" w:w="80"/>
+              <w:right w:type="dxa" w:w="100"/>
+            </w:tcMar>
+            <w:vAlign w:val="center"/>
+          </w:tcPr>
+          <w:p>
+            <w:pPr>
+              <w:jc w:val="left"/>
+            </w:pPr>
+            <w:r>
+              <w:rPr>
+                <w:rFonts w:ascii="Calibri" w:cs="Calibri" w:eastAsia="Calibri" w:hAnsi="Calibri"/>
+                <w:b w:val="false"/>
+                <w:bCs w:val="false"/>
+                <w:sz w:val="20"/>
+                <w:szCs w:val="20"/>
+              </w:rPr>
+              <w:t xml:space="preserve">—</w:t>
+            </w:r>
+          </w:p>
+        </w:tc>
+        <w:tc>
+          <w:tcPr>
+            <w:tcW w:type="dxa" w:w="4030"/>
+            <w:tcMar>
+              <w:top w:type="dxa" w:w="80"/>
+              <w:left w:type="dxa" w:w="100"/>
+              <w:bottom w:type="dxa" w:w="80"/>
+              <w:right w:type="dxa" w:w="100"/>
+            </w:tcMar>
+            <w:vAlign w:val="center"/>
+          </w:tcPr>
+          <w:p>
+            <w:pPr>
+              <w:jc w:val="left"/>
+            </w:pPr>
+            <w:r>
+              <w:rPr>
+                <w:rFonts w:ascii="Calibri" w:cs="Calibri" w:eastAsia="Calibri" w:hAnsi="Calibri"/>
+                <w:b w:val="false"/>
+                <w:bCs w:val="false"/>
+                <w:sz w:val="20"/>
+                <w:szCs w:val="20"/>
+              </w:rPr>
+              <w:t xml:space="preserve">Người thao tác, lấy từ JWT claim</w:t>
+            </w:r>
+          </w:p>
+        </w:tc>
+      </w:tr>
+      <w:tr>
+        <w:tc>
+          <w:tcPr>
+            <w:tcW w:type="dxa" w:w="1650"/>
+            <w:shd w:fill="F2F6FB" w:val="clear"/>
+            <w:tcMar>
+              <w:top w:type="dxa" w:w="80"/>
+              <w:left w:type="dxa" w:w="100"/>
+              <w:bottom w:type="dxa" w:w="80"/>
+              <w:right w:type="dxa" w:w="100"/>
+            </w:tcMar>
+            <w:vAlign w:val="center"/>
+          </w:tcPr>
+          <w:p>
+            <w:pPr>
+              <w:jc w:val="left"/>
+            </w:pPr>
+            <w:r>
+              <w:rPr>
+                <w:rFonts w:ascii="Calibri" w:cs="Calibri" w:eastAsia="Calibri" w:hAnsi="Calibri"/>
+                <w:b w:val="false"/>
+                <w:bCs w:val="false"/>
+                <w:sz w:val="20"/>
+                <w:szCs w:val="20"/>
+              </w:rPr>
+              <w:t xml:space="preserve">Timestamp</w:t>
+            </w:r>
+          </w:p>
+        </w:tc>
+        <w:tc>
+          <w:tcPr>
+            <w:tcW w:type="dxa" w:w="1650"/>
+            <w:shd w:fill="F2F6FB" w:val="clear"/>
+            <w:tcMar>
+              <w:top w:type="dxa" w:w="80"/>
+              <w:left w:type="dxa" w:w="100"/>
+              <w:bottom w:type="dxa" w:w="80"/>
+              <w:right w:type="dxa" w:w="100"/>
+            </w:tcMar>
+            <w:vAlign w:val="center"/>
+          </w:tcPr>
+          <w:p>
+            <w:pPr>
+              <w:jc w:val="left"/>
+            </w:pPr>
+            <w:r>
+              <w:rPr>
+                <w:rFonts w:ascii="Calibri" w:cs="Calibri" w:eastAsia="Calibri" w:hAnsi="Calibri"/>
+                <w:b w:val="false"/>
+                <w:bCs w:val="false"/>
+                <w:sz w:val="20"/>
+                <w:szCs w:val="20"/>
+              </w:rPr>
+              <w:t xml:space="preserve">datetime2</w:t>
+            </w:r>
+          </w:p>
+        </w:tc>
+        <w:tc>
+          <w:tcPr>
+            <w:tcW w:type="dxa" w:w="1100"/>
+            <w:shd w:fill="F2F6FB" w:val="clear"/>
+            <w:tcMar>
+              <w:top w:type="dxa" w:w="80"/>
+              <w:left w:type="dxa" w:w="100"/>
+              <w:bottom w:type="dxa" w:w="80"/>
+              <w:right w:type="dxa" w:w="100"/>
+            </w:tcMar>
+            <w:vAlign w:val="center"/>
+          </w:tcPr>
+          <w:p>
+            <w:pPr>
+              <w:jc w:val="left"/>
+            </w:pPr>
+            <w:r>
+              <w:rPr>
+                <w:rFonts w:ascii="Calibri" w:cs="Calibri" w:eastAsia="Calibri" w:hAnsi="Calibri"/>
+                <w:b w:val="false"/>
+                <w:bCs w:val="false"/>
+                <w:sz w:val="20"/>
+                <w:szCs w:val="20"/>
+              </w:rPr>
+              <w:t xml:space="preserve">Không</w:t>
+            </w:r>
+          </w:p>
+        </w:tc>
+        <w:tc>
+          <w:tcPr>
+            <w:tcW w:type="dxa" w:w="2010"/>
+            <w:shd w:fill="F2F6FB" w:val="clear"/>
+            <w:tcMar>
+              <w:top w:type="dxa" w:w="80"/>
+              <w:left w:type="dxa" w:w="100"/>
+              <w:bottom w:type="dxa" w:w="80"/>
+              <w:right w:type="dxa" w:w="100"/>
+            </w:tcMar>
+            <w:vAlign w:val="center"/>
+          </w:tcPr>
+          <w:p>
+            <w:pPr>
+              <w:jc w:val="left"/>
+            </w:pPr>
+            <w:r>
+              <w:rPr>
+                <w:rFonts w:ascii="Calibri" w:cs="Calibri" w:eastAsia="Calibri" w:hAnsi="Calibri"/>
+                <w:b w:val="false"/>
+                <w:bCs w:val="false"/>
+                <w:sz w:val="20"/>
+                <w:szCs w:val="20"/>
+              </w:rPr>
+              <w:t xml:space="preserve">Index (cùng EntityName, EntityId)</w:t>
+            </w:r>
+          </w:p>
+        </w:tc>
+        <w:tc>
+          <w:tcPr>
+            <w:tcW w:type="dxa" w:w="4030"/>
+            <w:shd w:fill="F2F6FB" w:val="clear"/>
+            <w:tcMar>
+              <w:top w:type="dxa" w:w="80"/>
+              <w:left w:type="dxa" w:w="100"/>
+              <w:bottom w:type="dxa" w:w="80"/>
+              <w:right w:type="dxa" w:w="100"/>
+            </w:tcMar>
+            <w:vAlign w:val="center"/>
+          </w:tcPr>
+          <w:p>
+            <w:pPr>
+              <w:jc w:val="left"/>
+            </w:pPr>
+            <w:r>
+              <w:rPr>
+                <w:rFonts w:ascii="Calibri" w:cs="Calibri" w:eastAsia="Calibri" w:hAnsi="Calibri"/>
+                <w:b w:val="false"/>
+                <w:bCs w:val="false"/>
+                <w:sz w:val="20"/>
+                <w:szCs w:val="20"/>
+              </w:rPr>
+              <w:t xml:space="preserve">UTC; truy vấn lịch sử sắp xếp mới nhất trước</w:t>
+            </w:r>
+          </w:p>
+        </w:tc>
+      </w:tr>
+    </w:tbl>
+    <w:p>
+      <w:pPr>
+        <w:pStyle w:val="Heading2"/>
+        <w:spacing w:after="140" w:before="280"/>
+      </w:pPr>
+      <w:r>
+        <w:t xml:space="preserve">2.5. Thiết kế Index</w:t>
       </w:r>
     </w:p>
     <w:tbl>
@@ -5573,7 +9210,7 @@
                 <w:sz w:val="20"/>
                 <w:szCs w:val="20"/>
               </w:rPr>
-              <w:t xml:space="preserve">Tăng tốc tìm kiếm theo SĐT</w:t>
+              <w:t xml:space="preserve">Hỗ trợ tìm kiếm theo SĐT</w:t>
             </w:r>
           </w:p>
         </w:tc>
@@ -5603,7 +9240,7 @@
                 <w:sz w:val="20"/>
                 <w:szCs w:val="20"/>
               </w:rPr>
-              <w:t xml:space="preserve">IX_Customers_FullName</w:t>
+              <w:t xml:space="preserve">IX_Customers_IsDeleted</w:t>
             </w:r>
           </w:p>
         </w:tc>
@@ -5631,7 +9268,7 @@
                 <w:sz w:val="20"/>
                 <w:szCs w:val="20"/>
               </w:rPr>
-              <w:t xml:space="preserve">Non-clustered</w:t>
+              <w:t xml:space="preserve">Non-clustered, filtered [IsDeleted]=0</w:t>
             </w:r>
           </w:p>
         </w:tc>
@@ -5659,7 +9296,7 @@
                 <w:sz w:val="20"/>
                 <w:szCs w:val="20"/>
               </w:rPr>
-              <w:t xml:space="preserve">Hỗ trợ tìm kiếm theo Họ tên</w:t>
+              <w:t xml:space="preserve">Tối ưu vì gần như mọi truy vấn đi qua Global Query Filter IsDeleted=0</w:t>
             </w:r>
           </w:p>
         </w:tc>
@@ -5688,7 +9325,7 @@
                 <w:sz w:val="20"/>
                 <w:szCs w:val="20"/>
               </w:rPr>
-              <w:t xml:space="preserve">Filtered index IsDeleted=0</w:t>
+              <w:t xml:space="preserve">IX_Users_Username</w:t>
             </w:r>
           </w:p>
         </w:tc>
@@ -5715,7 +9352,7 @@
                 <w:sz w:val="20"/>
                 <w:szCs w:val="20"/>
               </w:rPr>
-              <w:t xml:space="preserve">Non-clustered, filtered</w:t>
+              <w:t xml:space="preserve">Unique</w:t>
             </w:r>
           </w:p>
         </w:tc>
@@ -5742,7 +9379,7 @@
                 <w:sz w:val="20"/>
                 <w:szCs w:val="20"/>
               </w:rPr>
-              <w:t xml:space="preserve">Tối ưu vì gần như mọi truy vấn đi qua Global Query Filter IsDeleted=0</w:t>
+              <w:t xml:space="preserve">Chặn trùng tên đăng nhập</w:t>
             </w:r>
           </w:p>
         </w:tc>
@@ -5772,7 +9409,7 @@
                 <w:sz w:val="20"/>
                 <w:szCs w:val="20"/>
               </w:rPr>
-              <w:t xml:space="preserve">IX_Users_Username</w:t>
+              <w:t xml:space="preserve">IX_RefreshTokens_TokenHash</w:t>
             </w:r>
           </w:p>
         </w:tc>
@@ -5828,19 +9465,201 @@
                 <w:sz w:val="20"/>
                 <w:szCs w:val="20"/>
               </w:rPr>
-              <w:t xml:space="preserve">Chặn trùng tên đăng nhập</w:t>
+              <w:t xml:space="preserve">Tra cứu refresh token theo hash khi refresh/logout (bổ sung)</w:t>
+            </w:r>
+          </w:p>
+        </w:tc>
+      </w:tr>
+      <w:tr>
+        <w:tc>
+          <w:tcPr>
+            <w:tcW w:type="dxa" w:w="2470"/>
+            <w:tcMar>
+              <w:top w:type="dxa" w:w="80"/>
+              <w:left w:type="dxa" w:w="100"/>
+              <w:bottom w:type="dxa" w:w="80"/>
+              <w:right w:type="dxa" w:w="100"/>
+            </w:tcMar>
+            <w:vAlign w:val="center"/>
+          </w:tcPr>
+          <w:p>
+            <w:pPr>
+              <w:jc w:val="left"/>
+            </w:pPr>
+            <w:r>
+              <w:rPr>
+                <w:rFonts w:ascii="Calibri" w:cs="Calibri" w:eastAsia="Calibri" w:hAnsi="Calibri"/>
+                <w:b w:val="false"/>
+                <w:bCs w:val="false"/>
+                <w:sz w:val="20"/>
+                <w:szCs w:val="20"/>
+              </w:rPr>
+              <w:t xml:space="preserve">IX_RefreshTokens_UserId</w:t>
+            </w:r>
+          </w:p>
+        </w:tc>
+        <w:tc>
+          <w:tcPr>
+            <w:tcW w:type="dxa" w:w="2200"/>
+            <w:tcMar>
+              <w:top w:type="dxa" w:w="80"/>
+              <w:left w:type="dxa" w:w="100"/>
+              <w:bottom w:type="dxa" w:w="80"/>
+              <w:right w:type="dxa" w:w="100"/>
+            </w:tcMar>
+            <w:vAlign w:val="center"/>
+          </w:tcPr>
+          <w:p>
+            <w:pPr>
+              <w:jc w:val="left"/>
+            </w:pPr>
+            <w:r>
+              <w:rPr>
+                <w:rFonts w:ascii="Calibri" w:cs="Calibri" w:eastAsia="Calibri" w:hAnsi="Calibri"/>
+                <w:b w:val="false"/>
+                <w:bCs w:val="false"/>
+                <w:sz w:val="20"/>
+                <w:szCs w:val="20"/>
+              </w:rPr>
+              <w:t xml:space="preserve">Non-clustered</w:t>
+            </w:r>
+          </w:p>
+        </w:tc>
+        <w:tc>
+          <w:tcPr>
+            <w:tcW w:type="dxa" w:w="5770"/>
+            <w:tcMar>
+              <w:top w:type="dxa" w:w="80"/>
+              <w:left w:type="dxa" w:w="100"/>
+              <w:bottom w:type="dxa" w:w="80"/>
+              <w:right w:type="dxa" w:w="100"/>
+            </w:tcMar>
+            <w:vAlign w:val="center"/>
+          </w:tcPr>
+          <w:p>
+            <w:pPr>
+              <w:jc w:val="left"/>
+            </w:pPr>
+            <w:r>
+              <w:rPr>
+                <w:rFonts w:ascii="Calibri" w:cs="Calibri" w:eastAsia="Calibri" w:hAnsi="Calibri"/>
+                <w:b w:val="false"/>
+                <w:bCs w:val="false"/>
+                <w:sz w:val="20"/>
+                <w:szCs w:val="20"/>
+              </w:rPr>
+              <w:t xml:space="preserve">Hỗ trợ FK tới Users (bổ sung)</w:t>
+            </w:r>
+          </w:p>
+        </w:tc>
+      </w:tr>
+      <w:tr>
+        <w:tc>
+          <w:tcPr>
+            <w:tcW w:type="dxa" w:w="2470"/>
+            <w:shd w:fill="F2F6FB" w:val="clear"/>
+            <w:tcMar>
+              <w:top w:type="dxa" w:w="80"/>
+              <w:left w:type="dxa" w:w="100"/>
+              <w:bottom w:type="dxa" w:w="80"/>
+              <w:right w:type="dxa" w:w="100"/>
+            </w:tcMar>
+            <w:vAlign w:val="center"/>
+          </w:tcPr>
+          <w:p>
+            <w:pPr>
+              <w:jc w:val="left"/>
+            </w:pPr>
+            <w:r>
+              <w:rPr>
+                <w:rFonts w:ascii="Calibri" w:cs="Calibri" w:eastAsia="Calibri" w:hAnsi="Calibri"/>
+                <w:b w:val="false"/>
+                <w:bCs w:val="false"/>
+                <w:sz w:val="20"/>
+                <w:szCs w:val="20"/>
+              </w:rPr>
+              <w:t xml:space="preserve">IX_AuditLogs_EntityName_EntityId_Timestamp</w:t>
+            </w:r>
+          </w:p>
+        </w:tc>
+        <w:tc>
+          <w:tcPr>
+            <w:tcW w:type="dxa" w:w="2200"/>
+            <w:shd w:fill="F2F6FB" w:val="clear"/>
+            <w:tcMar>
+              <w:top w:type="dxa" w:w="80"/>
+              <w:left w:type="dxa" w:w="100"/>
+              <w:bottom w:type="dxa" w:w="80"/>
+              <w:right w:type="dxa" w:w="100"/>
+            </w:tcMar>
+            <w:vAlign w:val="center"/>
+          </w:tcPr>
+          <w:p>
+            <w:pPr>
+              <w:jc w:val="left"/>
+            </w:pPr>
+            <w:r>
+              <w:rPr>
+                <w:rFonts w:ascii="Calibri" w:cs="Calibri" w:eastAsia="Calibri" w:hAnsi="Calibri"/>
+                <w:b w:val="false"/>
+                <w:bCs w:val="false"/>
+                <w:sz w:val="20"/>
+                <w:szCs w:val="20"/>
+              </w:rPr>
+              <w:t xml:space="preserve">Non-clustered, composite</w:t>
+            </w:r>
+          </w:p>
+        </w:tc>
+        <w:tc>
+          <w:tcPr>
+            <w:tcW w:type="dxa" w:w="5770"/>
+            <w:shd w:fill="F2F6FB" w:val="clear"/>
+            <w:tcMar>
+              <w:top w:type="dxa" w:w="80"/>
+              <w:left w:type="dxa" w:w="100"/>
+              <w:bottom w:type="dxa" w:w="80"/>
+              <w:right w:type="dxa" w:w="100"/>
+            </w:tcMar>
+            <w:vAlign w:val="center"/>
+          </w:tcPr>
+          <w:p>
+            <w:pPr>
+              <w:jc w:val="left"/>
+            </w:pPr>
+            <w:r>
+              <w:rPr>
+                <w:rFonts w:ascii="Calibri" w:cs="Calibri" w:eastAsia="Calibri" w:hAnsi="Calibri"/>
+                <w:b w:val="false"/>
+                <w:bCs w:val="false"/>
+                <w:sz w:val="20"/>
+                <w:szCs w:val="20"/>
+              </w:rPr>
+              <w:t xml:space="preserve">Truy vấn lịch sử của 1 khách hàng theo thời gian (bổ sung)</w:t>
             </w:r>
           </w:p>
         </w:tc>
       </w:tr>
     </w:tbl>
+    <w:p>
+      <w:pPr>
+        <w:spacing w:after="160" w:before="120"/>
+      </w:pPr>
+      <w:r>
+        <w:rPr>
+          <w:rFonts w:ascii="Calibri" w:cs="Calibri" w:eastAsia="Calibri" w:hAnsi="Calibri"/>
+          <w:sz w:val="22"/>
+          <w:szCs w:val="22"/>
+        </w:rPr>
+        <w:t xml:space="preserve">Ghi chú: bản phân tích ban đầu dự kiến IX_Customers_FullName; khi triển khai không tạo index này vì tìm kiếm dùng Contains() (LIKE '%...%') nên SQL Server không tận dụng được B-tree index — chỉ tốn chi phí ghi. Nếu dữ liệu lớn, hướng cải tiến là Full-Text Search.</w:t>
+      </w:r>
+    </w:p>
     <w:p>
       <w:pPr>
         <w:pStyle w:val="Heading2"/>
         <w:spacing w:after="140" w:before="280"/>
       </w:pPr>
       <w:r>
-        <w:t xml:space="preserve">2.4. Stored Procedure / Trigger</w:t>
+        <w:t xml:space="preserve">2.6. Stored Procedure / Trigger</w:t>
       </w:r>
     </w:p>
     <w:p>
@@ -5889,7 +9708,7 @@
           <w:sz w:val="22"/>
           <w:szCs w:val="22"/>
         </w:rPr>
-        <w:t xml:space="preserve">EF Core 8 cung cấp SaveChangesInterceptor để tự động chuyển lệnh DELETE thành UPDATE IsDeleted=1 — đạt cùng mục tiêu "không cho Trigger tự ý can thiệp câu lệnh" mà một Trigger DB thường được dùng để làm, nhưng nằm trong source code C#.</w:t>
+        <w:t xml:space="preserve">EF Core 8 cung cấp SaveChangesInterceptor để tự động chuyển lệnh DELETE thành UPDATE IsDeleted=1 và tự ghi AuditLogs — đạt cùng mục tiêu mà Trigger DB thường được dùng, nhưng nằm trong source code C# (SoftDeleteAndAuditInterceptor, AuditLogInterceptor).</w:t>
       </w:r>
     </w:p>
     <w:p>
@@ -5934,7 +9753,7 @@
         <w:spacing w:after="140" w:before="280"/>
       </w:pPr>
       <w:r>
-        <w:t xml:space="preserve">2.5. Quan hệ &amp; Audit trail</w:t>
+        <w:t xml:space="preserve">2.7. Quan hệ &amp; Audit trail</w:t>
       </w:r>
     </w:p>
     <w:p>
@@ -5947,7 +9766,20 @@
           <w:sz w:val="22"/>
           <w:szCs w:val="22"/>
         </w:rPr>
-        <w:t xml:space="preserve">Không có khóa ngoại (Foreign Key) giữa Users và Customers. Trường CreatedBy/UpdatedBy trên bảng Customers lưu Username dạng chuỗi (denormalized) thay vì FK sang Users.Id, vì hệ thống hiện chỉ có 1 tài khoản admin duy nhất — tránh JOIN không cần thiết. Nếu sau này mở rộng nhiều user/role, khuyến nghị đổi sang FK thật + Include khi cần truy vết đầy đủ.</w:t>
+        <w:t xml:space="preserve">Không có khóa ngoại giữa Users và Customers: CreatedBy/UpdatedBy trên Customers lưu Username dạng chuỗi (denormalized) vì hệ thống chỉ có 1 tài khoản admin — tránh JOIN không cần thiết. RefreshTokens có khóa ngoại UserId → Users.Id (ON DELETE CASCADE). AuditLogs cố ý không có khóa ngoại tới Customers (EntityId lưu dạng chuỗi) để lịch sử tồn tại độc lập với bản ghi được ghi vết và dùng chung được cho các entity khác sau này.</w:t>
+      </w:r>
+    </w:p>
+    <w:p>
+      <w:pPr>
+        <w:spacing w:after="160"/>
+      </w:pPr>
+      <w:r>
+        <w:rPr>
+          <w:rFonts w:ascii="Calibri" w:cs="Calibri" w:eastAsia="Calibri" w:hAnsi="Calibri"/>
+          <w:sz w:val="22"/>
+          <w:szCs w:val="22"/>
+        </w:rPr>
+        <w:t xml:space="preserve">Audit trail gồm 2 lớp, đều ghi tự động qua SaveChangesInterceptor: (1) CreatedBy/CreatedAt/UpdatedBy/UpdatedAt trên Customers — biết nhanh ai tạo/sửa gần nhất; (2) bảng AuditLogs — toàn bộ lịch sử, chỉ lưu các field thực sự thay đổi dưới dạng JSON. Bản phân tích ban đầu đánh giá bảng lịch sử riêng là chưa cần; khi triển khai đã bổ sung vì yêu cầu truy vết của hệ thống tài chính.</w:t>
       </w:r>
     </w:p>
     <w:p>
@@ -5969,7 +9801,7 @@
           <w:sz w:val="22"/>
           <w:szCs w:val="22"/>
         </w:rPr>
-        <w:t xml:space="preserve">Bảng dưới đây là tổng hợp theo 9 hạng mục lớn. Bảng chi tiết đầy đủ (chia nhỏ tới từng tác vụ cụ thể — ví dụ "Code API thêm mới", "Làm UI trang danh sách"... theo đúng mức độ cụ thể được yêu cầu) nằm trong file đính kèm docs/Estimation-WBS.xlsx.</w:t>
+        <w:t xml:space="preserve">Bảng dưới đây tổng hợp theo 10 hạng mục lớn: 9 hạng mục ước lượng gốc (46.0 giờ) và 1 hạng mục bổ sung cho phạm vi phát sinh sau MVP. Bảng chi tiết đầy đủ (chia nhỏ tới từng tác vụ cụ thể — ví dụ "Code API thêm mới", "Làm UI trang danh sách"... theo đúng mức độ cụ thể được yêu cầu) nằm trong file đính kèm docs/Estimation-WBS.xlsx.</w:t>
       </w:r>
     </w:p>
     <w:tbl>
@@ -6840,6 +10672,92 @@
           </w:p>
         </w:tc>
       </w:tr>
+      <w:tr>
+        <w:tc>
+          <w:tcPr>
+            <w:tcW w:type="dxa" w:w="700"/>
+            <w:shd w:fill="F2F6FB" w:val="clear"/>
+            <w:tcMar>
+              <w:top w:type="dxa" w:w="80"/>
+              <w:left w:type="dxa" w:w="100"/>
+              <w:bottom w:type="dxa" w:w="80"/>
+              <w:right w:type="dxa" w:w="100"/>
+            </w:tcMar>
+            <w:vAlign w:val="center"/>
+          </w:tcPr>
+          <w:p>
+            <w:pPr>
+              <w:jc w:val="left"/>
+            </w:pPr>
+            <w:r>
+              <w:rPr>
+                <w:rFonts w:ascii="Calibri" w:cs="Calibri" w:eastAsia="Calibri" w:hAnsi="Calibri"/>
+                <w:b w:val="false"/>
+                <w:bCs w:val="false"/>
+                <w:sz w:val="20"/>
+                <w:szCs w:val="20"/>
+              </w:rPr>
+              <w:t xml:space="preserve">10</w:t>
+            </w:r>
+          </w:p>
+        </w:tc>
+        <w:tc>
+          <w:tcPr>
+            <w:tcW w:type="dxa" w:w="7640"/>
+            <w:shd w:fill="F2F6FB" w:val="clear"/>
+            <w:tcMar>
+              <w:top w:type="dxa" w:w="80"/>
+              <w:left w:type="dxa" w:w="100"/>
+              <w:bottom w:type="dxa" w:w="80"/>
+              <w:right w:type="dxa" w:w="100"/>
+            </w:tcMar>
+            <w:vAlign w:val="center"/>
+          </w:tcPr>
+          <w:p>
+            <w:pPr>
+              <w:jc w:val="left"/>
+            </w:pPr>
+            <w:r>
+              <w:rPr>
+                <w:rFonts w:ascii="Calibri" w:cs="Calibri" w:eastAsia="Calibri" w:hAnsi="Calibri"/>
+                <w:b w:val="false"/>
+                <w:bCs w:val="false"/>
+                <w:sz w:val="20"/>
+                <w:szCs w:val="20"/>
+              </w:rPr>
+              <w:t xml:space="preserve">Mở rộng sau MVP (sửa lỗi khởi động, UI nhận diện CEP, Audit Log, refresh token &amp; khóa tài khoản, security headers, cập nhật tài liệu)</w:t>
+            </w:r>
+          </w:p>
+        </w:tc>
+        <w:tc>
+          <w:tcPr>
+            <w:tcW w:type="dxa" w:w="2100"/>
+            <w:shd w:fill="F2F6FB" w:val="clear"/>
+            <w:tcMar>
+              <w:top w:type="dxa" w:w="80"/>
+              <w:left w:type="dxa" w:w="100"/>
+              <w:bottom w:type="dxa" w:w="80"/>
+              <w:right w:type="dxa" w:w="100"/>
+            </w:tcMar>
+            <w:vAlign w:val="center"/>
+          </w:tcPr>
+          <w:p>
+            <w:pPr>
+              <w:jc w:val="left"/>
+            </w:pPr>
+            <w:r>
+              <w:rPr>
+                <w:rFonts w:ascii="Calibri" w:cs="Calibri" w:eastAsia="Calibri" w:hAnsi="Calibri"/>
+                <w:b w:val="false"/>
+                <w:bCs w:val="false"/>
+                <w:sz w:val="20"/>
+                <w:szCs w:val="20"/>
+              </w:rPr>
+              <w:t xml:space="preserve">21.5</w:t>
+            </w:r>
+          </w:p>
+        </w:tc>
+      </w:tr>
     </w:tbl>
     <w:p>
       <w:pPr>
@@ -6854,7 +10772,7 @@
           <w:sz w:val="22"/>
           <w:szCs w:val="22"/>
         </w:rPr>
-        <w:t xml:space="preserve">Tổng cộng: 46.0 giờ (~6 ngày làm việc, tính 8 giờ/ngày)</w:t>
+        <w:t xml:space="preserve">Tổng cộng: 67.5 giờ (~8.4 ngày làm việc, tính 8 giờ/ngày) — gồm 46.0 giờ ước lượng gốc và 21.5 giờ phạm vi bổ sung</w:t>
       </w:r>
     </w:p>
     <w:p>

</xml_diff>